<commit_message>
Aggiorna vincoli ForeignKey e materiali progetto
</commit_message>
<xml_diff>
--- a/Relazione.docx
+++ b/Relazione.docx
@@ -225,9 +225,27 @@
             <w:vAlign w:val="center"/>
           </w:tcPr>
           <w:p>
-            <w:r>
-              <w:t>Requisito in linguaggio naturale</w:t>
-            </w:r>
+            <w:proofErr w:type="spellStart"/>
+            <w:r>
+              <w:t>Requisito</w:t>
+            </w:r>
+            <w:proofErr w:type="spellEnd"/>
+            <w:r>
+              <w:t xml:space="preserve"> in </w:t>
+            </w:r>
+            <w:proofErr w:type="spellStart"/>
+            <w:r>
+              <w:t>linguaggio</w:t>
+            </w:r>
+            <w:proofErr w:type="spellEnd"/>
+            <w:r>
+              <w:t xml:space="preserve"> </w:t>
+            </w:r>
+            <w:proofErr w:type="spellStart"/>
+            <w:r>
+              <w:t>naturale</w:t>
+            </w:r>
+            <w:proofErr w:type="spellEnd"/>
           </w:p>
         </w:tc>
       </w:tr>
@@ -931,9 +949,11 @@
             <w:vAlign w:val="center"/>
           </w:tcPr>
           <w:p>
+            <w:proofErr w:type="spellStart"/>
             <w:r>
               <w:t>Classificazione</w:t>
             </w:r>
+            <w:proofErr w:type="spellEnd"/>
           </w:p>
         </w:tc>
         <w:tc>
@@ -949,9 +969,11 @@
             <w:vAlign w:val="center"/>
           </w:tcPr>
           <w:p>
+            <w:proofErr w:type="spellStart"/>
             <w:r>
               <w:t>Motivazione</w:t>
             </w:r>
+            <w:proofErr w:type="spellEnd"/>
           </w:p>
         </w:tc>
       </w:tr>
@@ -964,9 +986,11 @@
             <w:tcW w:w="3400" w:type="dxa"/>
           </w:tcPr>
           <w:p>
+            <w:proofErr w:type="spellStart"/>
             <w:r>
               <w:t>Allieva</w:t>
             </w:r>
+            <w:proofErr w:type="spellEnd"/>
           </w:p>
         </w:tc>
         <w:tc>
@@ -974,9 +998,11 @@
             <w:tcW w:w="3400" w:type="dxa"/>
           </w:tcPr>
           <w:p>
+            <w:proofErr w:type="spellStart"/>
             <w:r>
               <w:t>Entità</w:t>
             </w:r>
+            <w:proofErr w:type="spellEnd"/>
           </w:p>
         </w:tc>
         <w:tc>
@@ -1017,9 +1043,11 @@
             <w:tcW w:w="3400" w:type="dxa"/>
           </w:tcPr>
           <w:p>
+            <w:proofErr w:type="spellStart"/>
             <w:r>
               <w:t>Entità</w:t>
             </w:r>
+            <w:proofErr w:type="spellEnd"/>
           </w:p>
         </w:tc>
         <w:tc>
@@ -1076,9 +1104,11 @@
             <w:tcW w:w="3400" w:type="dxa"/>
           </w:tcPr>
           <w:p>
+            <w:proofErr w:type="spellStart"/>
             <w:r>
               <w:t>Attributi</w:t>
             </w:r>
+            <w:proofErr w:type="spellEnd"/>
           </w:p>
         </w:tc>
         <w:tc>
@@ -1119,9 +1149,11 @@
             <w:tcW w:w="3400" w:type="dxa"/>
           </w:tcPr>
           <w:p>
+            <w:proofErr w:type="spellStart"/>
             <w:r>
               <w:t>Entità</w:t>
             </w:r>
+            <w:proofErr w:type="spellEnd"/>
           </w:p>
         </w:tc>
         <w:tc>
@@ -1164,9 +1196,11 @@
             <w:tcW w:w="3400" w:type="dxa"/>
           </w:tcPr>
           <w:p>
+            <w:proofErr w:type="spellStart"/>
             <w:r>
               <w:t>Relazione</w:t>
             </w:r>
+            <w:proofErr w:type="spellEnd"/>
           </w:p>
         </w:tc>
         <w:tc>
@@ -1209,9 +1243,11 @@
             <w:tcW w:w="3400" w:type="dxa"/>
           </w:tcPr>
           <w:p>
+            <w:proofErr w:type="spellStart"/>
             <w:r>
               <w:t>Entità</w:t>
             </w:r>
+            <w:proofErr w:type="spellEnd"/>
           </w:p>
         </w:tc>
         <w:tc>
@@ -1254,9 +1290,11 @@
             <w:tcW w:w="3400" w:type="dxa"/>
           </w:tcPr>
           <w:p>
+            <w:proofErr w:type="spellStart"/>
             <w:r>
               <w:t>Entità</w:t>
             </w:r>
+            <w:proofErr w:type="spellEnd"/>
           </w:p>
         </w:tc>
         <w:tc>
@@ -1297,9 +1335,11 @@
             <w:tcW w:w="3400" w:type="dxa"/>
           </w:tcPr>
           <w:p>
+            <w:proofErr w:type="spellStart"/>
             <w:r>
               <w:t>Entità</w:t>
             </w:r>
+            <w:proofErr w:type="spellEnd"/>
           </w:p>
         </w:tc>
         <w:tc>
@@ -1342,9 +1382,11 @@
             <w:tcW w:w="3400" w:type="dxa"/>
           </w:tcPr>
           <w:p>
+            <w:proofErr w:type="spellStart"/>
             <w:r>
               <w:t>Entità</w:t>
             </w:r>
+            <w:proofErr w:type="spellEnd"/>
           </w:p>
         </w:tc>
         <w:tc>
@@ -1385,9 +1427,11 @@
             <w:tcW w:w="3400" w:type="dxa"/>
           </w:tcPr>
           <w:p>
+            <w:proofErr w:type="spellStart"/>
             <w:r>
               <w:t>Entità</w:t>
             </w:r>
+            <w:proofErr w:type="spellEnd"/>
           </w:p>
         </w:tc>
         <w:tc>
@@ -1430,9 +1474,11 @@
             <w:tcW w:w="3400" w:type="dxa"/>
           </w:tcPr>
           <w:p>
+            <w:proofErr w:type="spellStart"/>
             <w:r>
               <w:t>Entità</w:t>
             </w:r>
+            <w:proofErr w:type="spellEnd"/>
           </w:p>
         </w:tc>
         <w:tc>
@@ -1483,9 +1529,11 @@
             <w:tcW w:w="3400" w:type="dxa"/>
           </w:tcPr>
           <w:p>
+            <w:proofErr w:type="spellStart"/>
             <w:r>
               <w:t>Relazione</w:t>
             </w:r>
+            <w:proofErr w:type="spellEnd"/>
           </w:p>
         </w:tc>
         <w:tc>
@@ -1539,9 +1587,19 @@
             <w:tcW w:w="3400" w:type="dxa"/>
           </w:tcPr>
           <w:p>
-            <w:r>
-              <w:t>Relazione con attributi</w:t>
-            </w:r>
+            <w:proofErr w:type="spellStart"/>
+            <w:r>
+              <w:t>Relazione</w:t>
+            </w:r>
+            <w:proofErr w:type="spellEnd"/>
+            <w:r>
+              <w:t xml:space="preserve"> con </w:t>
+            </w:r>
+            <w:proofErr w:type="spellStart"/>
+            <w:r>
+              <w:t>attributi</w:t>
+            </w:r>
+            <w:proofErr w:type="spellEnd"/>
           </w:p>
         </w:tc>
         <w:tc>
@@ -1592,9 +1650,11 @@
             <w:tcW w:w="3400" w:type="dxa"/>
           </w:tcPr>
           <w:p>
+            <w:proofErr w:type="spellStart"/>
             <w:r>
               <w:t>Vincolo</w:t>
             </w:r>
+            <w:proofErr w:type="spellEnd"/>
           </w:p>
         </w:tc>
         <w:tc>
@@ -1694,9 +1754,27 @@
             <w:vAlign w:val="center"/>
           </w:tcPr>
           <w:p>
-            <w:r>
-              <w:t>Perché è stata scelta</w:t>
-            </w:r>
+            <w:proofErr w:type="spellStart"/>
+            <w:r>
+              <w:t>Perché</w:t>
+            </w:r>
+            <w:proofErr w:type="spellEnd"/>
+            <w:r>
+              <w:t xml:space="preserve"> è </w:t>
+            </w:r>
+            <w:proofErr w:type="spellStart"/>
+            <w:r>
+              <w:t>stata</w:t>
+            </w:r>
+            <w:proofErr w:type="spellEnd"/>
+            <w:r>
+              <w:t xml:space="preserve"> </w:t>
+            </w:r>
+            <w:proofErr w:type="spellStart"/>
+            <w:r>
+              <w:t>scelta</w:t>
+            </w:r>
+            <w:proofErr w:type="spellEnd"/>
           </w:p>
         </w:tc>
       </w:tr>
@@ -2082,9 +2160,11 @@
             <w:vAlign w:val="center"/>
           </w:tcPr>
           <w:p>
+            <w:proofErr w:type="spellStart"/>
             <w:r>
               <w:t>Relazione</w:t>
             </w:r>
+            <w:proofErr w:type="spellEnd"/>
           </w:p>
         </w:tc>
         <w:tc>
@@ -2100,9 +2180,19 @@
             <w:vAlign w:val="center"/>
           </w:tcPr>
           <w:p>
-            <w:r>
-              <w:t>Entità coinvolte</w:t>
-            </w:r>
+            <w:proofErr w:type="spellStart"/>
+            <w:r>
+              <w:t>Entità</w:t>
+            </w:r>
+            <w:proofErr w:type="spellEnd"/>
+            <w:r>
+              <w:t xml:space="preserve"> </w:t>
+            </w:r>
+            <w:proofErr w:type="spellStart"/>
+            <w:r>
+              <w:t>coinvolte</w:t>
+            </w:r>
+            <w:proofErr w:type="spellEnd"/>
           </w:p>
         </w:tc>
         <w:tc>
@@ -2118,9 +2208,11 @@
             <w:vAlign w:val="center"/>
           </w:tcPr>
           <w:p>
+            <w:proofErr w:type="spellStart"/>
             <w:r>
               <w:t>Cardinalità</w:t>
             </w:r>
+            <w:proofErr w:type="spellEnd"/>
           </w:p>
         </w:tc>
         <w:tc>
@@ -2136,9 +2228,11 @@
             <w:vAlign w:val="center"/>
           </w:tcPr>
           <w:p>
+            <w:proofErr w:type="spellStart"/>
             <w:r>
               <w:t>Motivazione</w:t>
             </w:r>
+            <w:proofErr w:type="spellEnd"/>
           </w:p>
         </w:tc>
       </w:tr>
@@ -2161,8 +2255,13 @@
             <w:tcW w:w="2550" w:type="dxa"/>
           </w:tcPr>
           <w:p>
-            <w:r>
-              <w:t>Allieva - Corso</w:t>
+            <w:proofErr w:type="spellStart"/>
+            <w:r>
+              <w:t>Allieva</w:t>
+            </w:r>
+            <w:proofErr w:type="spellEnd"/>
+            <w:r>
+              <w:t xml:space="preserve"> - Corso</w:t>
             </w:r>
           </w:p>
         </w:tc>
@@ -2171,8 +2270,13 @@
             <w:tcW w:w="2550" w:type="dxa"/>
           </w:tcPr>
           <w:p>
-            <w:r>
-              <w:t>N : 1</w:t>
+            <w:proofErr w:type="gramStart"/>
+            <w:r>
+              <w:t>N :</w:t>
+            </w:r>
+            <w:proofErr w:type="gramEnd"/>
+            <w:r>
+              <w:t xml:space="preserve"> 1</w:t>
             </w:r>
           </w:p>
         </w:tc>
@@ -2215,9 +2319,19 @@
             <w:tcW w:w="2550" w:type="dxa"/>
           </w:tcPr>
           <w:p>
-            <w:r>
-              <w:t>Allieva - Competizione</w:t>
-            </w:r>
+            <w:proofErr w:type="spellStart"/>
+            <w:r>
+              <w:t>Allieva</w:t>
+            </w:r>
+            <w:proofErr w:type="spellEnd"/>
+            <w:r>
+              <w:t xml:space="preserve"> - </w:t>
+            </w:r>
+            <w:proofErr w:type="spellStart"/>
+            <w:r>
+              <w:t>Competizione</w:t>
+            </w:r>
+            <w:proofErr w:type="spellEnd"/>
           </w:p>
         </w:tc>
         <w:tc>
@@ -2225,8 +2339,13 @@
             <w:tcW w:w="2550" w:type="dxa"/>
           </w:tcPr>
           <w:p>
-            <w:r>
-              <w:t>N : M</w:t>
+            <w:proofErr w:type="gramStart"/>
+            <w:r>
+              <w:t>N :</w:t>
+            </w:r>
+            <w:proofErr w:type="gramEnd"/>
+            <w:r>
+              <w:t xml:space="preserve"> M</w:t>
             </w:r>
           </w:p>
         </w:tc>
@@ -2278,8 +2397,13 @@
             <w:tcW w:w="2550" w:type="dxa"/>
           </w:tcPr>
           <w:p>
-            <w:r>
-              <w:t>1 : N</w:t>
+            <w:proofErr w:type="gramStart"/>
+            <w:r>
+              <w:t>1 :</w:t>
+            </w:r>
+            <w:proofErr w:type="gramEnd"/>
+            <w:r>
+              <w:t xml:space="preserve"> N</w:t>
             </w:r>
           </w:p>
         </w:tc>
@@ -2322,8 +2446,13 @@
           </w:tcPr>
           <w:p>
             <w:r>
-              <w:t>Corso - Lezione</w:t>
-            </w:r>
+              <w:t xml:space="preserve">Corso - </w:t>
+            </w:r>
+            <w:proofErr w:type="spellStart"/>
+            <w:r>
+              <w:t>Lezione</w:t>
+            </w:r>
+            <w:proofErr w:type="spellEnd"/>
           </w:p>
         </w:tc>
         <w:tc>
@@ -2331,8 +2460,13 @@
             <w:tcW w:w="2550" w:type="dxa"/>
           </w:tcPr>
           <w:p>
-            <w:r>
-              <w:t>1 : N</w:t>
+            <w:proofErr w:type="gramStart"/>
+            <w:r>
+              <w:t>1 :</w:t>
+            </w:r>
+            <w:proofErr w:type="gramEnd"/>
+            <w:r>
+              <w:t xml:space="preserve"> N</w:t>
             </w:r>
           </w:p>
         </w:tc>
@@ -2375,8 +2509,13 @@
           </w:tcPr>
           <w:p>
             <w:r>
-              <w:t>Maestra - Lezione</w:t>
-            </w:r>
+              <w:t xml:space="preserve">Maestra - </w:t>
+            </w:r>
+            <w:proofErr w:type="spellStart"/>
+            <w:r>
+              <w:t>Lezione</w:t>
+            </w:r>
+            <w:proofErr w:type="spellEnd"/>
           </w:p>
         </w:tc>
         <w:tc>
@@ -2384,8 +2523,13 @@
             <w:tcW w:w="2550" w:type="dxa"/>
           </w:tcPr>
           <w:p>
-            <w:r>
-              <w:t>1 : N</w:t>
+            <w:proofErr w:type="gramStart"/>
+            <w:r>
+              <w:t>1 :</w:t>
+            </w:r>
+            <w:proofErr w:type="gramEnd"/>
+            <w:r>
+              <w:t xml:space="preserve"> N</w:t>
             </w:r>
           </w:p>
         </w:tc>
@@ -2427,9 +2571,27 @@
             <w:tcW w:w="2550" w:type="dxa"/>
           </w:tcPr>
           <w:p>
-            <w:r>
-              <w:t>Allieva - Pagamento Allieva</w:t>
-            </w:r>
+            <w:proofErr w:type="spellStart"/>
+            <w:r>
+              <w:t>Allieva</w:t>
+            </w:r>
+            <w:proofErr w:type="spellEnd"/>
+            <w:r>
+              <w:t xml:space="preserve"> - </w:t>
+            </w:r>
+            <w:proofErr w:type="spellStart"/>
+            <w:r>
+              <w:t>Pagamento</w:t>
+            </w:r>
+            <w:proofErr w:type="spellEnd"/>
+            <w:r>
+              <w:t xml:space="preserve"> </w:t>
+            </w:r>
+            <w:proofErr w:type="spellStart"/>
+            <w:r>
+              <w:t>Allieva</w:t>
+            </w:r>
+            <w:proofErr w:type="spellEnd"/>
           </w:p>
         </w:tc>
         <w:tc>
@@ -2437,8 +2599,13 @@
             <w:tcW w:w="2550" w:type="dxa"/>
           </w:tcPr>
           <w:p>
-            <w:r>
-              <w:t>1 : N</w:t>
+            <w:proofErr w:type="gramStart"/>
+            <w:r>
+              <w:t>1 :</w:t>
+            </w:r>
+            <w:proofErr w:type="gramEnd"/>
+            <w:r>
+              <w:t xml:space="preserve"> N</w:t>
             </w:r>
           </w:p>
         </w:tc>
@@ -2481,7 +2648,15 @@
           </w:tcPr>
           <w:p>
             <w:r>
-              <w:t>Maestra - Pagamento Maestra</w:t>
+              <w:t xml:space="preserve">Maestra - </w:t>
+            </w:r>
+            <w:proofErr w:type="spellStart"/>
+            <w:r>
+              <w:t>Pagamento</w:t>
+            </w:r>
+            <w:proofErr w:type="spellEnd"/>
+            <w:r>
+              <w:t xml:space="preserve"> Maestra</w:t>
             </w:r>
           </w:p>
         </w:tc>
@@ -2490,8 +2665,13 @@
             <w:tcW w:w="2550" w:type="dxa"/>
           </w:tcPr>
           <w:p>
-            <w:r>
-              <w:t>1 : N</w:t>
+            <w:proofErr w:type="gramStart"/>
+            <w:r>
+              <w:t>1 :</w:t>
+            </w:r>
+            <w:proofErr w:type="gramEnd"/>
+            <w:r>
+              <w:t xml:space="preserve"> N</w:t>
             </w:r>
           </w:p>
         </w:tc>
@@ -2534,8 +2714,13 @@
           </w:tcPr>
           <w:p>
             <w:r>
-              <w:t>Saggio - Coreografia</w:t>
-            </w:r>
+              <w:t xml:space="preserve">Saggio - </w:t>
+            </w:r>
+            <w:proofErr w:type="spellStart"/>
+            <w:r>
+              <w:t>Coreografia</w:t>
+            </w:r>
+            <w:proofErr w:type="spellEnd"/>
           </w:p>
         </w:tc>
         <w:tc>
@@ -2543,8 +2728,13 @@
             <w:tcW w:w="2550" w:type="dxa"/>
           </w:tcPr>
           <w:p>
-            <w:r>
-              <w:t>1 : N</w:t>
+            <w:proofErr w:type="gramStart"/>
+            <w:r>
+              <w:t>1 :</w:t>
+            </w:r>
+            <w:proofErr w:type="gramEnd"/>
+            <w:r>
+              <w:t xml:space="preserve"> N</w:t>
             </w:r>
           </w:p>
         </w:tc>
@@ -2586,8 +2776,13 @@
             <w:tcW w:w="2550" w:type="dxa"/>
           </w:tcPr>
           <w:p>
-            <w:r>
-              <w:t>Coreografia - Maestra</w:t>
+            <w:proofErr w:type="spellStart"/>
+            <w:r>
+              <w:t>Coreografia</w:t>
+            </w:r>
+            <w:proofErr w:type="spellEnd"/>
+            <w:r>
+              <w:t xml:space="preserve"> - Maestra</w:t>
             </w:r>
           </w:p>
         </w:tc>
@@ -2596,8 +2791,13 @@
             <w:tcW w:w="2550" w:type="dxa"/>
           </w:tcPr>
           <w:p>
-            <w:r>
-              <w:t>N : 1</w:t>
+            <w:proofErr w:type="gramStart"/>
+            <w:r>
+              <w:t>N :</w:t>
+            </w:r>
+            <w:proofErr w:type="gramEnd"/>
+            <w:r>
+              <w:t xml:space="preserve"> 1</w:t>
             </w:r>
           </w:p>
         </w:tc>
@@ -2639,8 +2839,13 @@
             <w:tcW w:w="2550" w:type="dxa"/>
           </w:tcPr>
           <w:p>
-            <w:r>
-              <w:t>Coreografia - Corso</w:t>
+            <w:proofErr w:type="spellStart"/>
+            <w:r>
+              <w:t>Coreografia</w:t>
+            </w:r>
+            <w:proofErr w:type="spellEnd"/>
+            <w:r>
+              <w:t xml:space="preserve"> - Corso</w:t>
             </w:r>
           </w:p>
         </w:tc>
@@ -2649,8 +2854,13 @@
             <w:tcW w:w="2550" w:type="dxa"/>
           </w:tcPr>
           <w:p>
-            <w:r>
-              <w:t>N : 1</w:t>
+            <w:proofErr w:type="gramStart"/>
+            <w:r>
+              <w:t>N :</w:t>
+            </w:r>
+            <w:proofErr w:type="gramEnd"/>
+            <w:r>
+              <w:t xml:space="preserve"> 1</w:t>
             </w:r>
           </w:p>
         </w:tc>
@@ -2692,9 +2902,19 @@
             <w:tcW w:w="2550" w:type="dxa"/>
           </w:tcPr>
           <w:p>
-            <w:r>
-              <w:t>Allieva - Costume - Coreografia</w:t>
-            </w:r>
+            <w:proofErr w:type="spellStart"/>
+            <w:r>
+              <w:t>Allieva</w:t>
+            </w:r>
+            <w:proofErr w:type="spellEnd"/>
+            <w:r>
+              <w:t xml:space="preserve"> - Costume - </w:t>
+            </w:r>
+            <w:proofErr w:type="spellStart"/>
+            <w:r>
+              <w:t>Coreografia</w:t>
+            </w:r>
+            <w:proofErr w:type="spellEnd"/>
           </w:p>
         </w:tc>
         <w:tc>
@@ -2702,8 +2922,21 @@
             <w:tcW w:w="2550" w:type="dxa"/>
           </w:tcPr>
           <w:p>
-            <w:r>
-              <w:t>N : N : N</w:t>
+            <w:proofErr w:type="gramStart"/>
+            <w:r>
+              <w:t>N :</w:t>
+            </w:r>
+            <w:proofErr w:type="gramEnd"/>
+            <w:r>
+              <w:t xml:space="preserve"> </w:t>
+            </w:r>
+            <w:proofErr w:type="gramStart"/>
+            <w:r>
+              <w:t>N :</w:t>
+            </w:r>
+            <w:proofErr w:type="gramEnd"/>
+            <w:r>
+              <w:t xml:space="preserve"> N</w:t>
             </w:r>
           </w:p>
         </w:tc>
@@ -2844,17 +3077,21 @@
     <w:p>
       <w:pPr>
         <w:jc w:val="center"/>
+        <w:rPr>
+          <w:lang w:val="it-IT"/>
+        </w:rPr>
       </w:pPr>
       <w:r>
         <w:rPr>
           <w:noProof/>
+          <w:lang w:val="it-IT"/>
         </w:rPr>
         <w:lastRenderedPageBreak/>
         <w:drawing>
-          <wp:inline distT="0" distB="0" distL="0" distR="0" wp14:anchorId="341B08A7" wp14:editId="0FB69A5C">
+          <wp:inline distT="0" distB="0" distL="0" distR="0" wp14:anchorId="07D9E0FA" wp14:editId="77D6E4D8">
             <wp:extent cx="6469380" cy="4853940"/>
             <wp:effectExtent l="0" t="0" r="7620" b="3810"/>
-            <wp:docPr id="1293932420" name="Immagine 5"/>
+            <wp:docPr id="1682063924" name="Immagine 1"/>
             <wp:cNvGraphicFramePr>
               <a:graphicFrameLocks xmlns:a="http://schemas.openxmlformats.org/drawingml/2006/main" noChangeAspect="1"/>
             </wp:cNvGraphicFramePr>
@@ -2862,7 +3099,7 @@
               <a:graphicData uri="http://schemas.openxmlformats.org/drawingml/2006/picture">
                 <pic:pic xmlns:pic="http://schemas.openxmlformats.org/drawingml/2006/picture">
                   <pic:nvPicPr>
-                    <pic:cNvPr id="0" name="Picture 5"/>
+                    <pic:cNvPr id="0" name="Picture 1"/>
                     <pic:cNvPicPr>
                       <a:picLocks noChangeAspect="1" noChangeArrowheads="1"/>
                     </pic:cNvPicPr>
@@ -2976,12 +3213,28 @@
             <w:tcW w:w="3400" w:type="dxa"/>
           </w:tcPr>
           <w:p>
+            <w:proofErr w:type="spellStart"/>
             <w:r>
               <w:rPr>
                 <w:b/>
               </w:rPr>
-              <w:t>Attributi specifici</w:t>
-            </w:r>
+              <w:t>Attributi</w:t>
+            </w:r>
+            <w:proofErr w:type="spellEnd"/>
+            <w:r>
+              <w:rPr>
+                <w:b/>
+              </w:rPr>
+              <w:t xml:space="preserve"> </w:t>
+            </w:r>
+            <w:proofErr w:type="spellStart"/>
+            <w:r>
+              <w:rPr>
+                <w:b/>
+              </w:rPr>
+              <w:t>specifici</w:t>
+            </w:r>
+            <w:proofErr w:type="spellEnd"/>
           </w:p>
         </w:tc>
         <w:tc>
@@ -2989,12 +3242,28 @@
             <w:tcW w:w="3400" w:type="dxa"/>
           </w:tcPr>
           <w:p>
+            <w:proofErr w:type="spellStart"/>
             <w:r>
               <w:rPr>
                 <w:b/>
               </w:rPr>
-              <w:t>Relazioni specifiche</w:t>
-            </w:r>
+              <w:t>Relazioni</w:t>
+            </w:r>
+            <w:proofErr w:type="spellEnd"/>
+            <w:r>
+              <w:rPr>
+                <w:b/>
+              </w:rPr>
+              <w:t xml:space="preserve"> </w:t>
+            </w:r>
+            <w:proofErr w:type="spellStart"/>
+            <w:r>
+              <w:rPr>
+                <w:b/>
+              </w:rPr>
+              <w:t>specifiche</w:t>
+            </w:r>
+            <w:proofErr w:type="spellEnd"/>
           </w:p>
         </w:tc>
       </w:tr>
@@ -3092,9 +3361,19 @@
             <w:tcW w:w="3400" w:type="dxa"/>
           </w:tcPr>
           <w:p>
-            <w:r>
-              <w:t>specializzazione, compenso_mensile</w:t>
-            </w:r>
+            <w:proofErr w:type="spellStart"/>
+            <w:r>
+              <w:t>specializzazione</w:t>
+            </w:r>
+            <w:proofErr w:type="spellEnd"/>
+            <w:r>
+              <w:t xml:space="preserve">, </w:t>
+            </w:r>
+            <w:proofErr w:type="spellStart"/>
+            <w:r>
+              <w:t>compenso_mensile</w:t>
+            </w:r>
+            <w:proofErr w:type="spellEnd"/>
           </w:p>
         </w:tc>
         <w:tc>
@@ -3205,12 +3484,14 @@
             <w:tcW w:w="3396" w:type="dxa"/>
           </w:tcPr>
           <w:p>
+            <w:proofErr w:type="spellStart"/>
             <w:r>
               <w:rPr>
                 <w:b/>
               </w:rPr>
               <w:t>Aspetto</w:t>
             </w:r>
+            <w:proofErr w:type="spellEnd"/>
           </w:p>
         </w:tc>
         <w:tc>
@@ -3218,12 +3499,14 @@
             <w:tcW w:w="3398" w:type="dxa"/>
           </w:tcPr>
           <w:p>
+            <w:proofErr w:type="spellStart"/>
             <w:r>
               <w:rPr>
                 <w:b/>
               </w:rPr>
               <w:t>Descrizione</w:t>
             </w:r>
+            <w:proofErr w:type="spellEnd"/>
           </w:p>
         </w:tc>
         <w:tc>
@@ -3231,12 +3514,14 @@
             <w:tcW w:w="3396" w:type="dxa"/>
           </w:tcPr>
           <w:p>
+            <w:proofErr w:type="spellStart"/>
             <w:r>
               <w:rPr>
                 <w:b/>
               </w:rPr>
               <w:t>Valutazione</w:t>
             </w:r>
+            <w:proofErr w:type="spellEnd"/>
           </w:p>
         </w:tc>
       </w:tr>
@@ -3249,9 +3534,11 @@
             <w:tcW w:w="3396" w:type="dxa"/>
           </w:tcPr>
           <w:p>
+            <w:proofErr w:type="spellStart"/>
             <w:r>
               <w:t>Struttura</w:t>
             </w:r>
+            <w:proofErr w:type="spellEnd"/>
           </w:p>
         </w:tc>
         <w:tc>
@@ -3668,8 +3955,21 @@
           </w:tcPr>
           <w:p>
             <w:r>
-              <w:t>Vincoli sulle relazioni</w:t>
-            </w:r>
+              <w:t xml:space="preserve">Vincoli </w:t>
+            </w:r>
+            <w:proofErr w:type="spellStart"/>
+            <w:r>
+              <w:t>sulle</w:t>
+            </w:r>
+            <w:proofErr w:type="spellEnd"/>
+            <w:r>
+              <w:t xml:space="preserve"> </w:t>
+            </w:r>
+            <w:proofErr w:type="spellStart"/>
+            <w:r>
+              <w:t>relazioni</w:t>
+            </w:r>
+            <w:proofErr w:type="spellEnd"/>
           </w:p>
         </w:tc>
         <w:tc>
@@ -3784,12 +4084,14 @@
             <w:tcW w:w="3398" w:type="dxa"/>
           </w:tcPr>
           <w:p>
+            <w:proofErr w:type="spellStart"/>
             <w:r>
               <w:rPr>
                 <w:b/>
               </w:rPr>
               <w:t>Descrizione</w:t>
             </w:r>
+            <w:proofErr w:type="spellEnd"/>
           </w:p>
         </w:tc>
         <w:tc>
@@ -3797,12 +4099,14 @@
             <w:tcW w:w="3396" w:type="dxa"/>
           </w:tcPr>
           <w:p>
+            <w:proofErr w:type="spellStart"/>
             <w:r>
               <w:rPr>
                 <w:b/>
               </w:rPr>
               <w:t>Valutazione</w:t>
             </w:r>
+            <w:proofErr w:type="spellEnd"/>
           </w:p>
         </w:tc>
       </w:tr>
@@ -3815,9 +4119,11 @@
             <w:tcW w:w="3396" w:type="dxa"/>
           </w:tcPr>
           <w:p>
+            <w:proofErr w:type="spellStart"/>
             <w:r>
               <w:t>Struttura</w:t>
             </w:r>
+            <w:proofErr w:type="spellEnd"/>
           </w:p>
         </w:tc>
         <w:tc>
@@ -4004,9 +4310,11 @@
             <w:tcW w:w="3396" w:type="dxa"/>
           </w:tcPr>
           <w:p>
+            <w:proofErr w:type="spellStart"/>
             <w:r>
               <w:t>Vantaggi</w:t>
             </w:r>
+            <w:proofErr w:type="spellEnd"/>
           </w:p>
         </w:tc>
         <w:tc>
@@ -4053,7 +4361,23 @@
             </w:r>
             <w:proofErr w:type="spellEnd"/>
             <w:r>
-              <w:t xml:space="preserve"> semplici da rappresentare.</w:t>
+              <w:t xml:space="preserve"> </w:t>
+            </w:r>
+            <w:proofErr w:type="spellStart"/>
+            <w:r>
+              <w:t>semplici</w:t>
+            </w:r>
+            <w:proofErr w:type="spellEnd"/>
+            <w:r>
+              <w:t xml:space="preserve"> da </w:t>
+            </w:r>
+            <w:proofErr w:type="spellStart"/>
+            <w:r>
+              <w:t>rappresentare</w:t>
+            </w:r>
+            <w:proofErr w:type="spellEnd"/>
+            <w:r>
+              <w:t>.</w:t>
             </w:r>
           </w:p>
         </w:tc>
@@ -4063,7 +4387,23 @@
           </w:tcPr>
           <w:p>
             <w:r>
-              <w:t>Maggiore chiarezza progettuale.</w:t>
+              <w:t xml:space="preserve">Maggiore </w:t>
+            </w:r>
+            <w:proofErr w:type="spellStart"/>
+            <w:r>
+              <w:t>chiarezza</w:t>
+            </w:r>
+            <w:proofErr w:type="spellEnd"/>
+            <w:r>
+              <w:t xml:space="preserve"> </w:t>
+            </w:r>
+            <w:proofErr w:type="spellStart"/>
+            <w:r>
+              <w:t>progettuale</w:t>
+            </w:r>
+            <w:proofErr w:type="spellEnd"/>
+            <w:r>
+              <w:t>.</w:t>
             </w:r>
           </w:p>
         </w:tc>
@@ -4077,9 +4417,11 @@
             <w:tcW w:w="3396" w:type="dxa"/>
           </w:tcPr>
           <w:p>
+            <w:proofErr w:type="spellStart"/>
             <w:r>
               <w:t>Svantaggi</w:t>
             </w:r>
+            <w:proofErr w:type="spellEnd"/>
           </w:p>
         </w:tc>
         <w:tc>
@@ -4156,7 +4498,15 @@
           </w:tcPr>
           <w:p>
             <w:r>
-              <w:t>Vincoli su ALLIEVA</w:t>
+              <w:t xml:space="preserve">Vincoli </w:t>
+            </w:r>
+            <w:proofErr w:type="spellStart"/>
+            <w:r>
+              <w:t>su</w:t>
+            </w:r>
+            <w:proofErr w:type="spellEnd"/>
+            <w:r>
+              <w:t xml:space="preserve"> ALLIEVA</w:t>
             </w:r>
           </w:p>
         </w:tc>
@@ -4215,7 +4565,15 @@
           </w:tcPr>
           <w:p>
             <w:r>
-              <w:t>Vincoli su MAESTRA</w:t>
+              <w:t xml:space="preserve">Vincoli </w:t>
+            </w:r>
+            <w:proofErr w:type="spellStart"/>
+            <w:r>
+              <w:t>su</w:t>
+            </w:r>
+            <w:proofErr w:type="spellEnd"/>
+            <w:r>
+              <w:t xml:space="preserve"> MAESTRA</w:t>
             </w:r>
           </w:p>
         </w:tc>
@@ -4287,8 +4645,13 @@
             <w:tcW w:w="3396" w:type="dxa"/>
           </w:tcPr>
           <w:p>
-            <w:r>
-              <w:t>Scelta finale</w:t>
+            <w:proofErr w:type="spellStart"/>
+            <w:r>
+              <w:t>Scelta</w:t>
+            </w:r>
+            <w:proofErr w:type="spellEnd"/>
+            <w:r>
+              <w:t xml:space="preserve"> finale</w:t>
             </w:r>
           </w:p>
         </w:tc>
@@ -4374,10 +4737,10 @@
         </w:rPr>
         <w:lastRenderedPageBreak/>
         <w:drawing>
-          <wp:inline distT="0" distB="0" distL="0" distR="0" wp14:anchorId="0D735A9A" wp14:editId="072ECE41">
+          <wp:inline distT="0" distB="0" distL="0" distR="0" wp14:anchorId="421E62A6" wp14:editId="2D01C995">
             <wp:extent cx="6469380" cy="4312920"/>
             <wp:effectExtent l="0" t="0" r="7620" b="0"/>
-            <wp:docPr id="898663784" name="Immagine 4"/>
+            <wp:docPr id="587931576" name="Immagine 1"/>
             <wp:cNvGraphicFramePr>
               <a:graphicFrameLocks xmlns:a="http://schemas.openxmlformats.org/drawingml/2006/main" noChangeAspect="1"/>
             </wp:cNvGraphicFramePr>
@@ -4385,7 +4748,7 @@
               <a:graphicData uri="http://schemas.openxmlformats.org/drawingml/2006/picture">
                 <pic:pic xmlns:pic="http://schemas.openxmlformats.org/drawingml/2006/picture">
                   <pic:nvPicPr>
-                    <pic:cNvPr id="0" name="Picture 4"/>
+                    <pic:cNvPr id="0" name="Picture 1"/>
                     <pic:cNvPicPr>
                       <a:picLocks noChangeAspect="1" noChangeArrowheads="1"/>
                     </pic:cNvPicPr>
@@ -4476,7 +4839,7 @@
         </w:trPr>
         <w:tc>
           <w:tcPr>
-            <w:tcW w:w="3400" w:type="dxa"/>
+            <w:tcW w:w="3148" w:type="dxa"/>
             <w:shd w:val="clear" w:color="auto" w:fill="6D3B8E"/>
             <w:tcMar>
               <w:top w:w="80" w:type="dxa"/>
@@ -4499,7 +4862,7 @@
         </w:tc>
         <w:tc>
           <w:tcPr>
-            <w:tcW w:w="3400" w:type="dxa"/>
+            <w:tcW w:w="3105" w:type="dxa"/>
             <w:shd w:val="clear" w:color="auto" w:fill="6D3B8E"/>
             <w:tcMar>
               <w:top w:w="80" w:type="dxa"/>
@@ -4510,14 +4873,24 @@
             <w:vAlign w:val="center"/>
           </w:tcPr>
           <w:p>
-            <w:r>
-              <w:t>Regola di traduzione</w:t>
-            </w:r>
-          </w:p>
-        </w:tc>
-        <w:tc>
-          <w:tcPr>
-            <w:tcW w:w="3400" w:type="dxa"/>
+            <w:proofErr w:type="spellStart"/>
+            <w:r>
+              <w:t>Regola</w:t>
+            </w:r>
+            <w:proofErr w:type="spellEnd"/>
+            <w:r>
+              <w:t xml:space="preserve"> di </w:t>
+            </w:r>
+            <w:proofErr w:type="spellStart"/>
+            <w:r>
+              <w:t>traduzione</w:t>
+            </w:r>
+            <w:proofErr w:type="spellEnd"/>
+          </w:p>
+        </w:tc>
+        <w:tc>
+          <w:tcPr>
+            <w:tcW w:w="3937" w:type="dxa"/>
             <w:shd w:val="clear" w:color="auto" w:fill="6D3B8E"/>
             <w:tcMar>
               <w:top w:w="80" w:type="dxa"/>
@@ -4528,9 +4901,35 @@
             <w:vAlign w:val="center"/>
           </w:tcPr>
           <w:p>
-            <w:r>
-              <w:t>Risultato nel modello logico</w:t>
-            </w:r>
+            <w:proofErr w:type="spellStart"/>
+            <w:r>
+              <w:t>Risultato</w:t>
+            </w:r>
+            <w:proofErr w:type="spellEnd"/>
+            <w:r>
+              <w:t xml:space="preserve"> </w:t>
+            </w:r>
+            <w:proofErr w:type="spellStart"/>
+            <w:r>
+              <w:t>nel</w:t>
+            </w:r>
+            <w:proofErr w:type="spellEnd"/>
+            <w:r>
+              <w:t xml:space="preserve"> </w:t>
+            </w:r>
+            <w:proofErr w:type="spellStart"/>
+            <w:r>
+              <w:t>modello</w:t>
+            </w:r>
+            <w:proofErr w:type="spellEnd"/>
+            <w:r>
+              <w:t xml:space="preserve"> </w:t>
+            </w:r>
+            <w:proofErr w:type="spellStart"/>
+            <w:r>
+              <w:t>logico</w:t>
+            </w:r>
+            <w:proofErr w:type="spellEnd"/>
           </w:p>
         </w:tc>
       </w:tr>
@@ -4540,17 +4939,19 @@
         </w:trPr>
         <w:tc>
           <w:tcPr>
-            <w:tcW w:w="3400" w:type="dxa"/>
-          </w:tcPr>
-          <w:p>
+            <w:tcW w:w="3148" w:type="dxa"/>
+          </w:tcPr>
+          <w:p>
+            <w:proofErr w:type="spellStart"/>
             <w:r>
               <w:t>Entità</w:t>
             </w:r>
-          </w:p>
-        </w:tc>
-        <w:tc>
-          <w:tcPr>
-            <w:tcW w:w="3400" w:type="dxa"/>
+            <w:proofErr w:type="spellEnd"/>
+          </w:p>
+        </w:tc>
+        <w:tc>
+          <w:tcPr>
+            <w:tcW w:w="3105" w:type="dxa"/>
           </w:tcPr>
           <w:p>
             <w:pPr>
@@ -4568,7 +4969,7 @@
         </w:tc>
         <w:tc>
           <w:tcPr>
-            <w:tcW w:w="3400" w:type="dxa"/>
+            <w:tcW w:w="3937" w:type="dxa"/>
           </w:tcPr>
           <w:p>
             <w:r>
@@ -4583,17 +4984,27 @@
         </w:trPr>
         <w:tc>
           <w:tcPr>
-            <w:tcW w:w="3400" w:type="dxa"/>
-          </w:tcPr>
-          <w:p>
-            <w:r>
-              <w:t>Attributo chiave</w:t>
-            </w:r>
-          </w:p>
-        </w:tc>
-        <w:tc>
-          <w:tcPr>
-            <w:tcW w:w="3400" w:type="dxa"/>
+            <w:tcW w:w="3148" w:type="dxa"/>
+          </w:tcPr>
+          <w:p>
+            <w:proofErr w:type="spellStart"/>
+            <w:r>
+              <w:t>Attributo</w:t>
+            </w:r>
+            <w:proofErr w:type="spellEnd"/>
+            <w:r>
+              <w:t xml:space="preserve"> </w:t>
+            </w:r>
+            <w:proofErr w:type="spellStart"/>
+            <w:r>
+              <w:t>chiave</w:t>
+            </w:r>
+            <w:proofErr w:type="spellEnd"/>
+          </w:p>
+        </w:tc>
+        <w:tc>
+          <w:tcPr>
+            <w:tcW w:w="3105" w:type="dxa"/>
           </w:tcPr>
           <w:p>
             <w:pPr>
@@ -4611,7 +5022,7 @@
         </w:tc>
         <w:tc>
           <w:tcPr>
-            <w:tcW w:w="3400" w:type="dxa"/>
+            <w:tcW w:w="3937" w:type="dxa"/>
           </w:tcPr>
           <w:p>
             <w:proofErr w:type="spellStart"/>
@@ -4639,17 +5050,27 @@
         </w:trPr>
         <w:tc>
           <w:tcPr>
-            <w:tcW w:w="3400" w:type="dxa"/>
-          </w:tcPr>
-          <w:p>
-            <w:r>
-              <w:t>Relazione 1:N</w:t>
-            </w:r>
-          </w:p>
-        </w:tc>
-        <w:tc>
-          <w:tcPr>
-            <w:tcW w:w="3400" w:type="dxa"/>
+            <w:tcW w:w="3148" w:type="dxa"/>
+          </w:tcPr>
+          <w:p>
+            <w:proofErr w:type="spellStart"/>
+            <w:r>
+              <w:t>Relazione</w:t>
+            </w:r>
+            <w:proofErr w:type="spellEnd"/>
+            <w:r>
+              <w:t xml:space="preserve"> </w:t>
+            </w:r>
+            <w:proofErr w:type="gramStart"/>
+            <w:r>
+              <w:t>1:N</w:t>
+            </w:r>
+            <w:proofErr w:type="gramEnd"/>
+          </w:p>
+        </w:tc>
+        <w:tc>
+          <w:tcPr>
+            <w:tcW w:w="3105" w:type="dxa"/>
           </w:tcPr>
           <w:p>
             <w:pPr>
@@ -4667,7 +5088,7 @@
         </w:tc>
         <w:tc>
           <w:tcPr>
-            <w:tcW w:w="3400" w:type="dxa"/>
+            <w:tcW w:w="3937" w:type="dxa"/>
           </w:tcPr>
           <w:p>
             <w:pPr>
@@ -4732,7 +5153,7 @@
         </w:trPr>
         <w:tc>
           <w:tcPr>
-            <w:tcW w:w="3400" w:type="dxa"/>
+            <w:tcW w:w="3148" w:type="dxa"/>
           </w:tcPr>
           <w:p>
             <w:proofErr w:type="spellStart"/>
@@ -4747,7 +5168,7 @@
         </w:tc>
         <w:tc>
           <w:tcPr>
-            <w:tcW w:w="3400" w:type="dxa"/>
+            <w:tcW w:w="3105" w:type="dxa"/>
           </w:tcPr>
           <w:p>
             <w:pPr>
@@ -4765,7 +5186,7 @@
         </w:tc>
         <w:tc>
           <w:tcPr>
-            <w:tcW w:w="3400" w:type="dxa"/>
+            <w:tcW w:w="3937" w:type="dxa"/>
           </w:tcPr>
           <w:p>
             <w:pPr>
@@ -4788,7 +5209,7 @@
         </w:trPr>
         <w:tc>
           <w:tcPr>
-            <w:tcW w:w="3400" w:type="dxa"/>
+            <w:tcW w:w="3148" w:type="dxa"/>
           </w:tcPr>
           <w:p>
             <w:proofErr w:type="spellStart"/>
@@ -4803,7 +5224,7 @@
         </w:tc>
         <w:tc>
           <w:tcPr>
-            <w:tcW w:w="3400" w:type="dxa"/>
+            <w:tcW w:w="3105" w:type="dxa"/>
           </w:tcPr>
           <w:p>
             <w:pPr>
@@ -4821,7 +5242,7 @@
         </w:tc>
         <w:tc>
           <w:tcPr>
-            <w:tcW w:w="3400" w:type="dxa"/>
+            <w:tcW w:w="3937" w:type="dxa"/>
           </w:tcPr>
           <w:p>
             <w:pPr>
@@ -4880,7 +5301,7 @@
         </w:trPr>
         <w:tc>
           <w:tcPr>
-            <w:tcW w:w="3400" w:type="dxa"/>
+            <w:tcW w:w="3148" w:type="dxa"/>
           </w:tcPr>
           <w:p>
             <w:proofErr w:type="spellStart"/>
@@ -4908,7 +5329,7 @@
         </w:tc>
         <w:tc>
           <w:tcPr>
-            <w:tcW w:w="3400" w:type="dxa"/>
+            <w:tcW w:w="3105" w:type="dxa"/>
           </w:tcPr>
           <w:p>
             <w:pPr>
@@ -4926,7 +5347,7 @@
         </w:tc>
         <w:tc>
           <w:tcPr>
-            <w:tcW w:w="3400" w:type="dxa"/>
+            <w:tcW w:w="3937" w:type="dxa"/>
           </w:tcPr>
           <w:p>
             <w:pPr>
@@ -4999,7 +5420,7 @@
         </w:trPr>
         <w:tc>
           <w:tcPr>
-            <w:tcW w:w="3400" w:type="dxa"/>
+            <w:tcW w:w="3148" w:type="dxa"/>
           </w:tcPr>
           <w:p>
             <w:proofErr w:type="spellStart"/>
@@ -5011,7 +5432,7 @@
         </w:tc>
         <w:tc>
           <w:tcPr>
-            <w:tcW w:w="3400" w:type="dxa"/>
+            <w:tcW w:w="3105" w:type="dxa"/>
           </w:tcPr>
           <w:p>
             <w:pPr>
@@ -5029,7 +5450,7 @@
         </w:tc>
         <w:tc>
           <w:tcPr>
-            <w:tcW w:w="3400" w:type="dxa"/>
+            <w:tcW w:w="3937" w:type="dxa"/>
           </w:tcPr>
           <w:p>
             <w:pPr>
@@ -5050,60 +5471,75 @@
     <w:p>
       <w:pPr>
         <w:pStyle w:val="Titolo1"/>
-        <w:rPr>
+        <w:spacing w:before="0"/>
+        <w:rPr>
+          <w:b w:val="0"/>
+          <w:bCs w:val="0"/>
+          <w:color w:val="auto"/>
+          <w:sz w:val="24"/>
+          <w:szCs w:val="24"/>
           <w:lang w:val="it-IT"/>
         </w:rPr>
       </w:pPr>
       <w:r>
         <w:rPr>
+          <w:color w:val="auto"/>
+          <w:sz w:val="24"/>
+          <w:szCs w:val="24"/>
           <w:lang w:val="it-IT"/>
         </w:rPr>
         <w:lastRenderedPageBreak/>
-        <w:t>8</w:t>
-      </w:r>
-      <w:r>
-        <w:rPr>
-          <w:lang w:val="it-IT"/>
-        </w:rPr>
-        <w:t>. Schema logico relazionale</w:t>
-      </w:r>
-    </w:p>
-    <w:p>
-      <w:pPr>
-        <w:jc w:val="both"/>
-        <w:rPr>
-          <w:lang w:val="it-IT"/>
-        </w:rPr>
-      </w:pPr>
-      <w:r>
-        <w:rPr>
-          <w:sz w:val="21"/>
-          <w:lang w:val="it-IT"/>
-        </w:rPr>
-        <w:t>Di seguito è riportato lo schema logico relazionale. In questa fase vengono indicate esplicitamente chiavi primarie e chiavi esterne.</w:t>
-      </w:r>
-    </w:p>
-    <w:p>
-      <w:pPr>
-        <w:rPr>
-          <w:lang w:val="it-IT"/>
-        </w:rPr>
-      </w:pPr>
-      <w:proofErr w:type="gramStart"/>
-      <w:r>
-        <w:rPr>
-          <w:rFonts w:ascii="Courier New" w:eastAsia="Courier New" w:hAnsi="Courier New"/>
-          <w:sz w:val="17"/>
-          <w:lang w:val="it-IT"/>
-        </w:rPr>
-        <w:t>MAESTRA(</w:t>
+        <w:t>Nota sull’implementazione</w:t>
+      </w:r>
+      <w:r>
+        <w:rPr>
+          <w:b w:val="0"/>
+          <w:bCs w:val="0"/>
+          <w:color w:val="auto"/>
+          <w:sz w:val="24"/>
+          <w:szCs w:val="24"/>
+          <w:lang w:val="it-IT"/>
+        </w:rPr>
+        <w:t xml:space="preserve">: nello schema logico vengono utilizzati nomi descrittivi per le chiavi primarie, come </w:t>
       </w:r>
       <w:proofErr w:type="spellStart"/>
-      <w:proofErr w:type="gramEnd"/>
-      <w:r>
-        <w:rPr>
-          <w:rFonts w:ascii="Courier New" w:eastAsia="Courier New" w:hAnsi="Courier New"/>
-          <w:sz w:val="17"/>
+      <w:r>
+        <w:rPr>
+          <w:b w:val="0"/>
+          <w:bCs w:val="0"/>
+          <w:i/>
+          <w:iCs/>
+          <w:color w:val="auto"/>
+          <w:sz w:val="24"/>
+          <w:szCs w:val="24"/>
+          <w:lang w:val="it-IT"/>
+        </w:rPr>
+        <w:t>id_allieva</w:t>
+      </w:r>
+      <w:proofErr w:type="spellEnd"/>
+      <w:r>
+        <w:rPr>
+          <w:b w:val="0"/>
+          <w:bCs w:val="0"/>
+          <w:i/>
+          <w:iCs/>
+          <w:color w:val="auto"/>
+          <w:sz w:val="24"/>
+          <w:szCs w:val="24"/>
+          <w:lang w:val="it-IT"/>
+        </w:rPr>
+        <w:t xml:space="preserve">, </w:t>
+      </w:r>
+      <w:proofErr w:type="spellStart"/>
+      <w:r>
+        <w:rPr>
+          <w:b w:val="0"/>
+          <w:bCs w:val="0"/>
+          <w:i/>
+          <w:iCs/>
+          <w:color w:val="auto"/>
+          <w:sz w:val="24"/>
+          <w:szCs w:val="24"/>
           <w:lang w:val="it-IT"/>
         </w:rPr>
         <w:t>id_maestra</w:t>
@@ -5111,1141 +5547,80 @@
       <w:proofErr w:type="spellEnd"/>
       <w:r>
         <w:rPr>
-          <w:rFonts w:ascii="Courier New" w:eastAsia="Courier New" w:hAnsi="Courier New"/>
-          <w:sz w:val="17"/>
-          <w:lang w:val="it-IT"/>
-        </w:rPr>
-        <w:t xml:space="preserve"> PK, nome, cognome, telefono, </w:t>
-      </w:r>
-      <w:proofErr w:type="gramStart"/>
-      <w:r>
-        <w:rPr>
-          <w:rFonts w:ascii="Courier New" w:eastAsia="Courier New" w:hAnsi="Courier New"/>
-          <w:sz w:val="17"/>
-          <w:lang w:val="it-IT"/>
-        </w:rPr>
-        <w:t>email</w:t>
-      </w:r>
-      <w:proofErr w:type="gramEnd"/>
-      <w:r>
-        <w:rPr>
-          <w:rFonts w:ascii="Courier New" w:eastAsia="Courier New" w:hAnsi="Courier New"/>
-          <w:sz w:val="17"/>
-          <w:lang w:val="it-IT"/>
-        </w:rPr>
-        <w:t xml:space="preserve">, specializzazione, </w:t>
+          <w:b w:val="0"/>
+          <w:bCs w:val="0"/>
+          <w:i/>
+          <w:iCs/>
+          <w:color w:val="auto"/>
+          <w:sz w:val="24"/>
+          <w:szCs w:val="24"/>
+          <w:lang w:val="it-IT"/>
+        </w:rPr>
+        <w:t xml:space="preserve">, </w:t>
       </w:r>
       <w:proofErr w:type="spellStart"/>
       <w:r>
         <w:rPr>
-          <w:rFonts w:ascii="Courier New" w:eastAsia="Courier New" w:hAnsi="Courier New"/>
-          <w:sz w:val="17"/>
-          <w:lang w:val="it-IT"/>
-        </w:rPr>
-        <w:t>compenso_mensile</w:t>
+          <w:b w:val="0"/>
+          <w:bCs w:val="0"/>
+          <w:i/>
+          <w:iCs/>
+          <w:color w:val="auto"/>
+          <w:sz w:val="24"/>
+          <w:szCs w:val="24"/>
+          <w:lang w:val="it-IT"/>
+        </w:rPr>
+        <w:t>id_corso</w:t>
       </w:r>
       <w:proofErr w:type="spellEnd"/>
       <w:r>
         <w:rPr>
-          <w:rFonts w:ascii="Courier New" w:eastAsia="Courier New" w:hAnsi="Courier New"/>
-          <w:sz w:val="17"/>
-          <w:lang w:val="it-IT"/>
-        </w:rPr>
-        <w:t>)</w:t>
-      </w:r>
-    </w:p>
-    <w:p>
-      <w:pPr>
-        <w:rPr>
-          <w:lang w:val="it-IT"/>
-        </w:rPr>
-      </w:pPr>
-      <w:proofErr w:type="gramStart"/>
-      <w:r>
-        <w:rPr>
-          <w:rFonts w:ascii="Courier New" w:eastAsia="Courier New" w:hAnsi="Courier New"/>
-          <w:sz w:val="17"/>
-          <w:lang w:val="it-IT"/>
-        </w:rPr>
-        <w:t>CORSO(</w:t>
-      </w:r>
-      <w:proofErr w:type="spellStart"/>
-      <w:proofErr w:type="gramEnd"/>
-      <w:r>
-        <w:rPr>
-          <w:rFonts w:ascii="Courier New" w:eastAsia="Courier New" w:hAnsi="Courier New"/>
-          <w:sz w:val="17"/>
-          <w:lang w:val="it-IT"/>
-        </w:rPr>
-        <w:t>id_corso</w:t>
-      </w:r>
-      <w:proofErr w:type="spellEnd"/>
-      <w:r>
-        <w:rPr>
-          <w:rFonts w:ascii="Courier New" w:eastAsia="Courier New" w:hAnsi="Courier New"/>
-          <w:sz w:val="17"/>
-          <w:lang w:val="it-IT"/>
-        </w:rPr>
-        <w:t xml:space="preserve"> PK, nome, livello, </w:t>
-      </w:r>
-      <w:proofErr w:type="spellStart"/>
-      <w:r>
-        <w:rPr>
-          <w:rFonts w:ascii="Courier New" w:eastAsia="Courier New" w:hAnsi="Courier New"/>
-          <w:sz w:val="17"/>
-          <w:lang w:val="it-IT"/>
-        </w:rPr>
-        <w:t>fascia_eta</w:t>
-      </w:r>
-      <w:proofErr w:type="spellEnd"/>
-      <w:r>
-        <w:rPr>
-          <w:rFonts w:ascii="Courier New" w:eastAsia="Courier New" w:hAnsi="Courier New"/>
-          <w:sz w:val="17"/>
-          <w:lang w:val="it-IT"/>
-        </w:rPr>
-        <w:t xml:space="preserve">, </w:t>
-      </w:r>
-      <w:proofErr w:type="spellStart"/>
-      <w:r>
-        <w:rPr>
-          <w:rFonts w:ascii="Courier New" w:eastAsia="Courier New" w:hAnsi="Courier New"/>
-          <w:sz w:val="17"/>
-          <w:lang w:val="it-IT"/>
-        </w:rPr>
-        <w:t>id_maestra</w:t>
-      </w:r>
-      <w:proofErr w:type="spellEnd"/>
-      <w:r>
-        <w:rPr>
-          <w:rFonts w:ascii="Courier New" w:eastAsia="Courier New" w:hAnsi="Courier New"/>
-          <w:sz w:val="17"/>
-          <w:lang w:val="it-IT"/>
-        </w:rPr>
-        <w:t xml:space="preserve"> FK -&gt; MAESTRA)</w:t>
-      </w:r>
-    </w:p>
-    <w:p>
-      <w:pPr>
-        <w:rPr>
-          <w:lang w:val="it-IT"/>
-        </w:rPr>
-      </w:pPr>
-      <w:proofErr w:type="gramStart"/>
-      <w:r>
-        <w:rPr>
-          <w:rFonts w:ascii="Courier New" w:eastAsia="Courier New" w:hAnsi="Courier New"/>
-          <w:sz w:val="17"/>
-          <w:lang w:val="it-IT"/>
-        </w:rPr>
-        <w:t>ALLIEVA(</w:t>
-      </w:r>
-      <w:proofErr w:type="spellStart"/>
-      <w:proofErr w:type="gramEnd"/>
-      <w:r>
-        <w:rPr>
-          <w:rFonts w:ascii="Courier New" w:eastAsia="Courier New" w:hAnsi="Courier New"/>
-          <w:sz w:val="17"/>
-          <w:lang w:val="it-IT"/>
-        </w:rPr>
-        <w:t>id_allieva</w:t>
-      </w:r>
-      <w:proofErr w:type="spellEnd"/>
-      <w:r>
-        <w:rPr>
-          <w:rFonts w:ascii="Courier New" w:eastAsia="Courier New" w:hAnsi="Courier New"/>
-          <w:sz w:val="17"/>
-          <w:lang w:val="it-IT"/>
-        </w:rPr>
-        <w:t xml:space="preserve"> PK, nome, cognome, </w:t>
-      </w:r>
-      <w:proofErr w:type="spellStart"/>
-      <w:r>
-        <w:rPr>
-          <w:rFonts w:ascii="Courier New" w:eastAsia="Courier New" w:hAnsi="Courier New"/>
-          <w:sz w:val="17"/>
-          <w:lang w:val="it-IT"/>
-        </w:rPr>
-        <w:t>data_nascita</w:t>
-      </w:r>
-      <w:proofErr w:type="spellEnd"/>
-      <w:r>
-        <w:rPr>
-          <w:rFonts w:ascii="Courier New" w:eastAsia="Courier New" w:hAnsi="Courier New"/>
-          <w:sz w:val="17"/>
-          <w:lang w:val="it-IT"/>
-        </w:rPr>
-        <w:t xml:space="preserve">, telefono, </w:t>
-      </w:r>
-      <w:proofErr w:type="gramStart"/>
-      <w:r>
-        <w:rPr>
-          <w:rFonts w:ascii="Courier New" w:eastAsia="Courier New" w:hAnsi="Courier New"/>
-          <w:sz w:val="17"/>
-          <w:lang w:val="it-IT"/>
-        </w:rPr>
-        <w:t>email</w:t>
-      </w:r>
-      <w:proofErr w:type="gramEnd"/>
-      <w:r>
-        <w:rPr>
-          <w:rFonts w:ascii="Courier New" w:eastAsia="Courier New" w:hAnsi="Courier New"/>
-          <w:sz w:val="17"/>
-          <w:lang w:val="it-IT"/>
-        </w:rPr>
-        <w:t xml:space="preserve">, </w:t>
-      </w:r>
-      <w:proofErr w:type="spellStart"/>
-      <w:r>
-        <w:rPr>
-          <w:rFonts w:ascii="Courier New" w:eastAsia="Courier New" w:hAnsi="Courier New"/>
-          <w:sz w:val="17"/>
-          <w:lang w:val="it-IT"/>
-        </w:rPr>
-        <w:t>data_iscrizione</w:t>
-      </w:r>
-      <w:proofErr w:type="spellEnd"/>
-      <w:r>
-        <w:rPr>
-          <w:rFonts w:ascii="Courier New" w:eastAsia="Courier New" w:hAnsi="Courier New"/>
-          <w:sz w:val="17"/>
-          <w:lang w:val="it-IT"/>
-        </w:rPr>
-        <w:t xml:space="preserve">, </w:t>
-      </w:r>
-      <w:proofErr w:type="spellStart"/>
-      <w:r>
-        <w:rPr>
-          <w:rFonts w:ascii="Courier New" w:eastAsia="Courier New" w:hAnsi="Courier New"/>
-          <w:sz w:val="17"/>
-          <w:lang w:val="it-IT"/>
-        </w:rPr>
-        <w:t>certificato_medico</w:t>
-      </w:r>
-      <w:proofErr w:type="spellEnd"/>
-      <w:r>
-        <w:rPr>
-          <w:rFonts w:ascii="Courier New" w:eastAsia="Courier New" w:hAnsi="Courier New"/>
-          <w:sz w:val="17"/>
-          <w:lang w:val="it-IT"/>
-        </w:rPr>
-        <w:t xml:space="preserve">, </w:t>
-      </w:r>
-      <w:proofErr w:type="spellStart"/>
-      <w:r>
-        <w:rPr>
-          <w:rFonts w:ascii="Courier New" w:eastAsia="Courier New" w:hAnsi="Courier New"/>
-          <w:sz w:val="17"/>
-          <w:lang w:val="it-IT"/>
-        </w:rPr>
-        <w:t>id_corso</w:t>
-      </w:r>
-      <w:proofErr w:type="spellEnd"/>
-      <w:r>
-        <w:rPr>
-          <w:rFonts w:ascii="Courier New" w:eastAsia="Courier New" w:hAnsi="Courier New"/>
-          <w:sz w:val="17"/>
-          <w:lang w:val="it-IT"/>
-        </w:rPr>
-        <w:t xml:space="preserve"> FK -&gt; CORSO)</w:t>
-      </w:r>
-    </w:p>
-    <w:p>
-      <w:pPr>
-        <w:rPr>
-          <w:lang w:val="it-IT"/>
-        </w:rPr>
-      </w:pPr>
-      <w:proofErr w:type="gramStart"/>
-      <w:r>
-        <w:rPr>
-          <w:rFonts w:ascii="Courier New" w:eastAsia="Courier New" w:hAnsi="Courier New"/>
-          <w:sz w:val="17"/>
-          <w:lang w:val="it-IT"/>
-        </w:rPr>
-        <w:t>LEZIONE(</w:t>
-      </w:r>
-      <w:proofErr w:type="spellStart"/>
-      <w:proofErr w:type="gramEnd"/>
-      <w:r>
-        <w:rPr>
-          <w:rFonts w:ascii="Courier New" w:eastAsia="Courier New" w:hAnsi="Courier New"/>
-          <w:sz w:val="17"/>
-          <w:lang w:val="it-IT"/>
-        </w:rPr>
-        <w:t>id_lezione</w:t>
-      </w:r>
-      <w:proofErr w:type="spellEnd"/>
-      <w:r>
-        <w:rPr>
-          <w:rFonts w:ascii="Courier New" w:eastAsia="Courier New" w:hAnsi="Courier New"/>
-          <w:sz w:val="17"/>
-          <w:lang w:val="it-IT"/>
-        </w:rPr>
-        <w:t xml:space="preserve"> PK, </w:t>
-      </w:r>
-      <w:proofErr w:type="spellStart"/>
-      <w:r>
-        <w:rPr>
-          <w:rFonts w:ascii="Courier New" w:eastAsia="Courier New" w:hAnsi="Courier New"/>
-          <w:sz w:val="17"/>
-          <w:lang w:val="it-IT"/>
-        </w:rPr>
-        <w:t>giorno_settimana</w:t>
-      </w:r>
-      <w:proofErr w:type="spellEnd"/>
-      <w:r>
-        <w:rPr>
-          <w:rFonts w:ascii="Courier New" w:eastAsia="Courier New" w:hAnsi="Courier New"/>
-          <w:sz w:val="17"/>
-          <w:lang w:val="it-IT"/>
-        </w:rPr>
-        <w:t xml:space="preserve">, </w:t>
-      </w:r>
-      <w:proofErr w:type="spellStart"/>
-      <w:r>
-        <w:rPr>
-          <w:rFonts w:ascii="Courier New" w:eastAsia="Courier New" w:hAnsi="Courier New"/>
-          <w:sz w:val="17"/>
-          <w:lang w:val="it-IT"/>
-        </w:rPr>
-        <w:t>ora_inizio</w:t>
-      </w:r>
-      <w:proofErr w:type="spellEnd"/>
-      <w:r>
-        <w:rPr>
-          <w:rFonts w:ascii="Courier New" w:eastAsia="Courier New" w:hAnsi="Courier New"/>
-          <w:sz w:val="17"/>
-          <w:lang w:val="it-IT"/>
-        </w:rPr>
-        <w:t xml:space="preserve">, </w:t>
-      </w:r>
-      <w:proofErr w:type="spellStart"/>
-      <w:r>
-        <w:rPr>
-          <w:rFonts w:ascii="Courier New" w:eastAsia="Courier New" w:hAnsi="Courier New"/>
-          <w:sz w:val="17"/>
-          <w:lang w:val="it-IT"/>
-        </w:rPr>
-        <w:t>ora_fine</w:t>
-      </w:r>
-      <w:proofErr w:type="spellEnd"/>
-      <w:r>
-        <w:rPr>
-          <w:rFonts w:ascii="Courier New" w:eastAsia="Courier New" w:hAnsi="Courier New"/>
-          <w:sz w:val="17"/>
-          <w:lang w:val="it-IT"/>
-        </w:rPr>
-        <w:t xml:space="preserve">, sala, </w:t>
-      </w:r>
-      <w:proofErr w:type="spellStart"/>
-      <w:r>
-        <w:rPr>
-          <w:rFonts w:ascii="Courier New" w:eastAsia="Courier New" w:hAnsi="Courier New"/>
-          <w:sz w:val="17"/>
-          <w:lang w:val="it-IT"/>
-        </w:rPr>
-        <w:t>id_corso</w:t>
-      </w:r>
-      <w:proofErr w:type="spellEnd"/>
-      <w:r>
-        <w:rPr>
-          <w:rFonts w:ascii="Courier New" w:eastAsia="Courier New" w:hAnsi="Courier New"/>
-          <w:sz w:val="17"/>
-          <w:lang w:val="it-IT"/>
-        </w:rPr>
-        <w:t xml:space="preserve"> FK -&gt; CORSO, </w:t>
-      </w:r>
-      <w:proofErr w:type="spellStart"/>
-      <w:r>
-        <w:rPr>
-          <w:rFonts w:ascii="Courier New" w:eastAsia="Courier New" w:hAnsi="Courier New"/>
-          <w:sz w:val="17"/>
-          <w:lang w:val="it-IT"/>
-        </w:rPr>
-        <w:t>id_maestra</w:t>
-      </w:r>
-      <w:proofErr w:type="spellEnd"/>
-      <w:r>
-        <w:rPr>
-          <w:rFonts w:ascii="Courier New" w:eastAsia="Courier New" w:hAnsi="Courier New"/>
-          <w:sz w:val="17"/>
-          <w:lang w:val="it-IT"/>
-        </w:rPr>
-        <w:t xml:space="preserve"> FK -&gt; MAESTRA)</w:t>
-      </w:r>
-    </w:p>
-    <w:p>
-      <w:pPr>
-        <w:rPr>
-          <w:lang w:val="it-IT"/>
-        </w:rPr>
-      </w:pPr>
-      <w:r>
-        <w:rPr>
-          <w:rFonts w:ascii="Courier New" w:eastAsia="Courier New" w:hAnsi="Courier New"/>
-          <w:sz w:val="17"/>
-          <w:lang w:val="it-IT"/>
-        </w:rPr>
-        <w:t>PAGAMENTO_</w:t>
-      </w:r>
-      <w:proofErr w:type="gramStart"/>
-      <w:r>
-        <w:rPr>
-          <w:rFonts w:ascii="Courier New" w:eastAsia="Courier New" w:hAnsi="Courier New"/>
-          <w:sz w:val="17"/>
-          <w:lang w:val="it-IT"/>
-        </w:rPr>
-        <w:t>ALLIEVA(</w:t>
-      </w:r>
-      <w:proofErr w:type="spellStart"/>
-      <w:proofErr w:type="gramEnd"/>
-      <w:r>
-        <w:rPr>
-          <w:rFonts w:ascii="Courier New" w:eastAsia="Courier New" w:hAnsi="Courier New"/>
-          <w:sz w:val="17"/>
-          <w:lang w:val="it-IT"/>
-        </w:rPr>
-        <w:t>id_pagamento</w:t>
-      </w:r>
-      <w:proofErr w:type="spellEnd"/>
-      <w:r>
-        <w:rPr>
-          <w:rFonts w:ascii="Courier New" w:eastAsia="Courier New" w:hAnsi="Courier New"/>
-          <w:sz w:val="17"/>
-          <w:lang w:val="it-IT"/>
-        </w:rPr>
-        <w:t xml:space="preserve"> PK, </w:t>
-      </w:r>
-      <w:proofErr w:type="spellStart"/>
-      <w:r>
-        <w:rPr>
-          <w:rFonts w:ascii="Courier New" w:eastAsia="Courier New" w:hAnsi="Courier New"/>
-          <w:sz w:val="17"/>
-          <w:lang w:val="it-IT"/>
-        </w:rPr>
-        <w:t>id_allieva</w:t>
-      </w:r>
-      <w:proofErr w:type="spellEnd"/>
-      <w:r>
-        <w:rPr>
-          <w:rFonts w:ascii="Courier New" w:eastAsia="Courier New" w:hAnsi="Courier New"/>
-          <w:sz w:val="17"/>
-          <w:lang w:val="it-IT"/>
-        </w:rPr>
-        <w:t xml:space="preserve"> FK -&gt; ALLIEVA, importo, </w:t>
-      </w:r>
-      <w:proofErr w:type="spellStart"/>
-      <w:r>
-        <w:rPr>
-          <w:rFonts w:ascii="Courier New" w:eastAsia="Courier New" w:hAnsi="Courier New"/>
-          <w:sz w:val="17"/>
-          <w:lang w:val="it-IT"/>
-        </w:rPr>
-        <w:t>data_scadenza</w:t>
-      </w:r>
-      <w:proofErr w:type="spellEnd"/>
-      <w:r>
-        <w:rPr>
-          <w:rFonts w:ascii="Courier New" w:eastAsia="Courier New" w:hAnsi="Courier New"/>
-          <w:sz w:val="17"/>
-          <w:lang w:val="it-IT"/>
-        </w:rPr>
-        <w:t xml:space="preserve">, </w:t>
-      </w:r>
-      <w:proofErr w:type="spellStart"/>
-      <w:r>
-        <w:rPr>
-          <w:rFonts w:ascii="Courier New" w:eastAsia="Courier New" w:hAnsi="Courier New"/>
-          <w:sz w:val="17"/>
-          <w:lang w:val="it-IT"/>
-        </w:rPr>
-        <w:t>data_pagamento</w:t>
-      </w:r>
-      <w:proofErr w:type="spellEnd"/>
-      <w:r>
-        <w:rPr>
-          <w:rFonts w:ascii="Courier New" w:eastAsia="Courier New" w:hAnsi="Courier New"/>
-          <w:sz w:val="17"/>
-          <w:lang w:val="it-IT"/>
-        </w:rPr>
-        <w:t>, stato, descrizione)</w:t>
-      </w:r>
-    </w:p>
-    <w:p>
-      <w:pPr>
-        <w:rPr>
-          <w:lang w:val="it-IT"/>
-        </w:rPr>
-      </w:pPr>
-      <w:r>
-        <w:rPr>
-          <w:rFonts w:ascii="Courier New" w:eastAsia="Courier New" w:hAnsi="Courier New"/>
-          <w:sz w:val="17"/>
-          <w:lang w:val="it-IT"/>
-        </w:rPr>
-        <w:t>PAGAMENTO_</w:t>
-      </w:r>
-      <w:proofErr w:type="gramStart"/>
-      <w:r>
-        <w:rPr>
-          <w:rFonts w:ascii="Courier New" w:eastAsia="Courier New" w:hAnsi="Courier New"/>
-          <w:sz w:val="17"/>
-          <w:lang w:val="it-IT"/>
-        </w:rPr>
-        <w:t>MAESTRA(</w:t>
-      </w:r>
-      <w:proofErr w:type="spellStart"/>
-      <w:proofErr w:type="gramEnd"/>
-      <w:r>
-        <w:rPr>
-          <w:rFonts w:ascii="Courier New" w:eastAsia="Courier New" w:hAnsi="Courier New"/>
-          <w:sz w:val="17"/>
-          <w:lang w:val="it-IT"/>
-        </w:rPr>
-        <w:t>id_pagamento</w:t>
-      </w:r>
-      <w:proofErr w:type="spellEnd"/>
-      <w:r>
-        <w:rPr>
-          <w:rFonts w:ascii="Courier New" w:eastAsia="Courier New" w:hAnsi="Courier New"/>
-          <w:sz w:val="17"/>
-          <w:lang w:val="it-IT"/>
-        </w:rPr>
-        <w:t xml:space="preserve"> PK, </w:t>
-      </w:r>
-      <w:proofErr w:type="spellStart"/>
-      <w:r>
-        <w:rPr>
-          <w:rFonts w:ascii="Courier New" w:eastAsia="Courier New" w:hAnsi="Courier New"/>
-          <w:sz w:val="17"/>
-          <w:lang w:val="it-IT"/>
-        </w:rPr>
-        <w:t>id_maestra</w:t>
-      </w:r>
-      <w:proofErr w:type="spellEnd"/>
-      <w:r>
-        <w:rPr>
-          <w:rFonts w:ascii="Courier New" w:eastAsia="Courier New" w:hAnsi="Courier New"/>
-          <w:sz w:val="17"/>
-          <w:lang w:val="it-IT"/>
-        </w:rPr>
-        <w:t xml:space="preserve"> FK -&gt; MAESTRA, importo, </w:t>
-      </w:r>
-      <w:proofErr w:type="spellStart"/>
-      <w:r>
-        <w:rPr>
-          <w:rFonts w:ascii="Courier New" w:eastAsia="Courier New" w:hAnsi="Courier New"/>
-          <w:sz w:val="17"/>
-          <w:lang w:val="it-IT"/>
-        </w:rPr>
-        <w:t>data_scadenza</w:t>
-      </w:r>
-      <w:proofErr w:type="spellEnd"/>
-      <w:r>
-        <w:rPr>
-          <w:rFonts w:ascii="Courier New" w:eastAsia="Courier New" w:hAnsi="Courier New"/>
-          <w:sz w:val="17"/>
-          <w:lang w:val="it-IT"/>
-        </w:rPr>
-        <w:t xml:space="preserve">, </w:t>
-      </w:r>
-      <w:proofErr w:type="spellStart"/>
-      <w:r>
-        <w:rPr>
-          <w:rFonts w:ascii="Courier New" w:eastAsia="Courier New" w:hAnsi="Courier New"/>
-          <w:sz w:val="17"/>
-          <w:lang w:val="it-IT"/>
-        </w:rPr>
-        <w:t>data_pagamento</w:t>
-      </w:r>
-      <w:proofErr w:type="spellEnd"/>
-      <w:r>
-        <w:rPr>
-          <w:rFonts w:ascii="Courier New" w:eastAsia="Courier New" w:hAnsi="Courier New"/>
-          <w:sz w:val="17"/>
-          <w:lang w:val="it-IT"/>
-        </w:rPr>
-        <w:t>, stato, descrizione)</w:t>
-      </w:r>
-    </w:p>
-    <w:p>
-      <w:pPr>
-        <w:rPr>
-          <w:lang w:val="it-IT"/>
-        </w:rPr>
-      </w:pPr>
-      <w:proofErr w:type="gramStart"/>
-      <w:r>
-        <w:rPr>
-          <w:rFonts w:ascii="Courier New" w:eastAsia="Courier New" w:hAnsi="Courier New"/>
-          <w:sz w:val="17"/>
-          <w:lang w:val="it-IT"/>
-        </w:rPr>
-        <w:t>SAGGIO(</w:t>
-      </w:r>
-      <w:proofErr w:type="spellStart"/>
-      <w:proofErr w:type="gramEnd"/>
-      <w:r>
-        <w:rPr>
-          <w:rFonts w:ascii="Courier New" w:eastAsia="Courier New" w:hAnsi="Courier New"/>
-          <w:sz w:val="17"/>
-          <w:lang w:val="it-IT"/>
-        </w:rPr>
-        <w:t>id_saggio</w:t>
-      </w:r>
-      <w:proofErr w:type="spellEnd"/>
-      <w:r>
-        <w:rPr>
-          <w:rFonts w:ascii="Courier New" w:eastAsia="Courier New" w:hAnsi="Courier New"/>
-          <w:sz w:val="17"/>
-          <w:lang w:val="it-IT"/>
-        </w:rPr>
-        <w:t xml:space="preserve"> PK, titolo, data, luogo, </w:t>
-      </w:r>
-      <w:proofErr w:type="spellStart"/>
-      <w:r>
-        <w:rPr>
-          <w:rFonts w:ascii="Courier New" w:eastAsia="Courier New" w:hAnsi="Courier New"/>
-          <w:sz w:val="17"/>
-          <w:lang w:val="it-IT"/>
-        </w:rPr>
-        <w:t>ora_inizio</w:t>
-      </w:r>
-      <w:proofErr w:type="spellEnd"/>
-      <w:r>
-        <w:rPr>
-          <w:rFonts w:ascii="Courier New" w:eastAsia="Courier New" w:hAnsi="Courier New"/>
-          <w:sz w:val="17"/>
-          <w:lang w:val="it-IT"/>
-        </w:rPr>
-        <w:t xml:space="preserve">, stato, </w:t>
-      </w:r>
-      <w:proofErr w:type="spellStart"/>
-      <w:r>
-        <w:rPr>
-          <w:rFonts w:ascii="Courier New" w:eastAsia="Courier New" w:hAnsi="Courier New"/>
-          <w:sz w:val="17"/>
-          <w:lang w:val="it-IT"/>
-        </w:rPr>
-        <w:t>numero_atti</w:t>
-      </w:r>
-      <w:proofErr w:type="spellEnd"/>
-      <w:r>
-        <w:rPr>
-          <w:rFonts w:ascii="Courier New" w:eastAsia="Courier New" w:hAnsi="Courier New"/>
-          <w:sz w:val="17"/>
-          <w:lang w:val="it-IT"/>
-        </w:rPr>
-        <w:t xml:space="preserve">, </w:t>
-      </w:r>
-      <w:proofErr w:type="spellStart"/>
-      <w:r>
-        <w:rPr>
-          <w:rFonts w:ascii="Courier New" w:eastAsia="Courier New" w:hAnsi="Courier New"/>
-          <w:sz w:val="17"/>
-          <w:lang w:val="it-IT"/>
-        </w:rPr>
-        <w:t>durata_totale</w:t>
-      </w:r>
-      <w:proofErr w:type="spellEnd"/>
-      <w:r>
-        <w:rPr>
-          <w:rFonts w:ascii="Courier New" w:eastAsia="Courier New" w:hAnsi="Courier New"/>
-          <w:sz w:val="17"/>
-          <w:lang w:val="it-IT"/>
-        </w:rPr>
-        <w:t>)</w:t>
-      </w:r>
-    </w:p>
-    <w:p>
-      <w:pPr>
-        <w:rPr>
-          <w:lang w:val="it-IT"/>
-        </w:rPr>
-      </w:pPr>
-      <w:proofErr w:type="gramStart"/>
-      <w:r>
-        <w:rPr>
-          <w:rFonts w:ascii="Courier New" w:eastAsia="Courier New" w:hAnsi="Courier New"/>
-          <w:sz w:val="17"/>
-          <w:lang w:val="it-IT"/>
-        </w:rPr>
-        <w:t>COREOGRAFIA(</w:t>
-      </w:r>
-      <w:proofErr w:type="spellStart"/>
-      <w:proofErr w:type="gramEnd"/>
-      <w:r>
-        <w:rPr>
-          <w:rFonts w:ascii="Courier New" w:eastAsia="Courier New" w:hAnsi="Courier New"/>
-          <w:sz w:val="17"/>
-          <w:lang w:val="it-IT"/>
-        </w:rPr>
-        <w:t>id_coreografia</w:t>
-      </w:r>
-      <w:proofErr w:type="spellEnd"/>
-      <w:r>
-        <w:rPr>
-          <w:rFonts w:ascii="Courier New" w:eastAsia="Courier New" w:hAnsi="Courier New"/>
-          <w:sz w:val="17"/>
-          <w:lang w:val="it-IT"/>
-        </w:rPr>
-        <w:t xml:space="preserve"> PK, nome, </w:t>
-      </w:r>
-      <w:proofErr w:type="spellStart"/>
-      <w:r>
-        <w:rPr>
-          <w:rFonts w:ascii="Courier New" w:eastAsia="Courier New" w:hAnsi="Courier New"/>
-          <w:sz w:val="17"/>
-          <w:lang w:val="it-IT"/>
-        </w:rPr>
-        <w:t>id_saggio</w:t>
-      </w:r>
-      <w:proofErr w:type="spellEnd"/>
-      <w:r>
-        <w:rPr>
-          <w:rFonts w:ascii="Courier New" w:eastAsia="Courier New" w:hAnsi="Courier New"/>
-          <w:sz w:val="17"/>
-          <w:lang w:val="it-IT"/>
-        </w:rPr>
-        <w:t xml:space="preserve"> FK -&gt; SAGGIO, </w:t>
-      </w:r>
-      <w:proofErr w:type="spellStart"/>
-      <w:r>
-        <w:rPr>
-          <w:rFonts w:ascii="Courier New" w:eastAsia="Courier New" w:hAnsi="Courier New"/>
-          <w:sz w:val="17"/>
-          <w:lang w:val="it-IT"/>
-        </w:rPr>
-        <w:t>id_corso</w:t>
-      </w:r>
-      <w:proofErr w:type="spellEnd"/>
-      <w:r>
-        <w:rPr>
-          <w:rFonts w:ascii="Courier New" w:eastAsia="Courier New" w:hAnsi="Courier New"/>
-          <w:sz w:val="17"/>
-          <w:lang w:val="it-IT"/>
-        </w:rPr>
-        <w:t xml:space="preserve"> FK -&gt; CORSO, </w:t>
-      </w:r>
-      <w:proofErr w:type="spellStart"/>
-      <w:r>
-        <w:rPr>
-          <w:rFonts w:ascii="Courier New" w:eastAsia="Courier New" w:hAnsi="Courier New"/>
-          <w:sz w:val="17"/>
-          <w:lang w:val="it-IT"/>
-        </w:rPr>
-        <w:t>id_maestra</w:t>
-      </w:r>
-      <w:proofErr w:type="spellEnd"/>
-      <w:r>
-        <w:rPr>
-          <w:rFonts w:ascii="Courier New" w:eastAsia="Courier New" w:hAnsi="Courier New"/>
-          <w:sz w:val="17"/>
-          <w:lang w:val="it-IT"/>
-        </w:rPr>
-        <w:t xml:space="preserve"> FK -&gt; MAESTRA, atto, </w:t>
-      </w:r>
-      <w:proofErr w:type="spellStart"/>
-      <w:r>
-        <w:rPr>
-          <w:rFonts w:ascii="Courier New" w:eastAsia="Courier New" w:hAnsi="Courier New"/>
-          <w:sz w:val="17"/>
-          <w:lang w:val="it-IT"/>
-        </w:rPr>
-        <w:t>ordine_uscita</w:t>
-      </w:r>
-      <w:proofErr w:type="spellEnd"/>
-      <w:r>
-        <w:rPr>
-          <w:rFonts w:ascii="Courier New" w:eastAsia="Courier New" w:hAnsi="Courier New"/>
-          <w:sz w:val="17"/>
-          <w:lang w:val="it-IT"/>
-        </w:rPr>
-        <w:t>, musica, durata)</w:t>
-      </w:r>
-    </w:p>
-    <w:p>
-      <w:pPr>
-        <w:rPr>
-          <w:lang w:val="it-IT"/>
-        </w:rPr>
-      </w:pPr>
-      <w:proofErr w:type="gramStart"/>
-      <w:r>
-        <w:rPr>
-          <w:rFonts w:ascii="Courier New" w:eastAsia="Courier New" w:hAnsi="Courier New"/>
-          <w:sz w:val="17"/>
-          <w:lang w:val="it-IT"/>
-        </w:rPr>
-        <w:t>COSTUME(</w:t>
-      </w:r>
-      <w:proofErr w:type="spellStart"/>
-      <w:proofErr w:type="gramEnd"/>
-      <w:r>
-        <w:rPr>
-          <w:rFonts w:ascii="Courier New" w:eastAsia="Courier New" w:hAnsi="Courier New"/>
-          <w:sz w:val="17"/>
-          <w:lang w:val="it-IT"/>
-        </w:rPr>
-        <w:t>id_costume</w:t>
-      </w:r>
-      <w:proofErr w:type="spellEnd"/>
-      <w:r>
-        <w:rPr>
-          <w:rFonts w:ascii="Courier New" w:eastAsia="Courier New" w:hAnsi="Courier New"/>
-          <w:sz w:val="17"/>
-          <w:lang w:val="it-IT"/>
-        </w:rPr>
-        <w:t xml:space="preserve"> PK, nome, descrizione, taglia, prezzo, fornitore, </w:t>
-      </w:r>
-      <w:proofErr w:type="spellStart"/>
-      <w:r>
-        <w:rPr>
-          <w:rFonts w:ascii="Courier New" w:eastAsia="Courier New" w:hAnsi="Courier New"/>
-          <w:sz w:val="17"/>
-          <w:lang w:val="it-IT"/>
-        </w:rPr>
-        <w:t>stato_ordine</w:t>
-      </w:r>
-      <w:proofErr w:type="spellEnd"/>
-      <w:r>
-        <w:rPr>
-          <w:rFonts w:ascii="Courier New" w:eastAsia="Courier New" w:hAnsi="Courier New"/>
-          <w:sz w:val="17"/>
-          <w:lang w:val="it-IT"/>
-        </w:rPr>
-        <w:t>)</w:t>
-      </w:r>
-    </w:p>
-    <w:p>
-      <w:pPr>
-        <w:rPr>
-          <w:rFonts w:ascii="Courier New" w:eastAsia="Courier New" w:hAnsi="Courier New"/>
-          <w:sz w:val="17"/>
-          <w:lang w:val="it-IT"/>
-        </w:rPr>
-      </w:pPr>
-      <w:r>
-        <w:rPr>
-          <w:rFonts w:ascii="Courier New" w:eastAsia="Courier New" w:hAnsi="Courier New"/>
-          <w:sz w:val="17"/>
-          <w:lang w:val="it-IT"/>
-        </w:rPr>
-        <w:t>ASSEGNAZIONE_</w:t>
-      </w:r>
-      <w:proofErr w:type="gramStart"/>
-      <w:r>
-        <w:rPr>
-          <w:rFonts w:ascii="Courier New" w:eastAsia="Courier New" w:hAnsi="Courier New"/>
-          <w:sz w:val="17"/>
-          <w:lang w:val="it-IT"/>
-        </w:rPr>
-        <w:t>COSTUMI(</w:t>
-      </w:r>
-      <w:proofErr w:type="spellStart"/>
-      <w:proofErr w:type="gramEnd"/>
-      <w:r>
-        <w:rPr>
-          <w:rFonts w:ascii="Courier New" w:eastAsia="Courier New" w:hAnsi="Courier New"/>
-          <w:sz w:val="17"/>
-          <w:lang w:val="it-IT"/>
-        </w:rPr>
-        <w:t>id_assegnazione</w:t>
-      </w:r>
-      <w:proofErr w:type="spellEnd"/>
-      <w:r>
-        <w:rPr>
-          <w:rFonts w:ascii="Courier New" w:eastAsia="Courier New" w:hAnsi="Courier New"/>
-          <w:sz w:val="17"/>
-          <w:lang w:val="it-IT"/>
-        </w:rPr>
-        <w:t xml:space="preserve"> PK, </w:t>
-      </w:r>
-      <w:proofErr w:type="spellStart"/>
-      <w:r>
-        <w:rPr>
-          <w:rFonts w:ascii="Courier New" w:eastAsia="Courier New" w:hAnsi="Courier New"/>
-          <w:sz w:val="17"/>
-          <w:lang w:val="it-IT"/>
-        </w:rPr>
-        <w:t>id_allieva</w:t>
-      </w:r>
-      <w:proofErr w:type="spellEnd"/>
-      <w:r>
-        <w:rPr>
-          <w:rFonts w:ascii="Courier New" w:eastAsia="Courier New" w:hAnsi="Courier New"/>
-          <w:sz w:val="17"/>
-          <w:lang w:val="it-IT"/>
-        </w:rPr>
-        <w:t xml:space="preserve"> FK -&gt; ALLIEVA, </w:t>
-      </w:r>
-      <w:proofErr w:type="spellStart"/>
-      <w:r>
-        <w:rPr>
-          <w:rFonts w:ascii="Courier New" w:eastAsia="Courier New" w:hAnsi="Courier New"/>
-          <w:sz w:val="17"/>
-          <w:lang w:val="it-IT"/>
-        </w:rPr>
-        <w:t>id_costume</w:t>
-      </w:r>
-      <w:proofErr w:type="spellEnd"/>
-      <w:r>
-        <w:rPr>
-          <w:rFonts w:ascii="Courier New" w:eastAsia="Courier New" w:hAnsi="Courier New"/>
-          <w:sz w:val="17"/>
-          <w:lang w:val="it-IT"/>
-        </w:rPr>
-        <w:t xml:space="preserve"> FK -&gt; COSTUME, </w:t>
-      </w:r>
-      <w:proofErr w:type="spellStart"/>
-      <w:r>
-        <w:rPr>
-          <w:rFonts w:ascii="Courier New" w:eastAsia="Courier New" w:hAnsi="Courier New"/>
-          <w:sz w:val="17"/>
-          <w:lang w:val="it-IT"/>
-        </w:rPr>
-        <w:t>id_coreografia</w:t>
-      </w:r>
-      <w:proofErr w:type="spellEnd"/>
-      <w:r>
-        <w:rPr>
-          <w:rFonts w:ascii="Courier New" w:eastAsia="Courier New" w:hAnsi="Courier New"/>
-          <w:sz w:val="17"/>
-          <w:lang w:val="it-IT"/>
-        </w:rPr>
-        <w:t xml:space="preserve"> FK -&gt; COREOGRAFIA, pagato, consegnato)</w:t>
-      </w:r>
-    </w:p>
-    <w:p>
-      <w:pPr>
-        <w:rPr>
-          <w:lang w:val="it-IT"/>
-        </w:rPr>
-      </w:pPr>
-      <w:proofErr w:type="gramStart"/>
-      <w:r>
-        <w:rPr>
-          <w:rFonts w:ascii="Courier New" w:hAnsi="Courier New"/>
-          <w:sz w:val="17"/>
-          <w:lang w:val="it-IT"/>
-        </w:rPr>
-        <w:t>COMPETIZIONE(</w:t>
-      </w:r>
-      <w:proofErr w:type="spellStart"/>
-      <w:proofErr w:type="gramEnd"/>
-      <w:r>
-        <w:rPr>
-          <w:rFonts w:ascii="Courier New" w:hAnsi="Courier New"/>
-          <w:sz w:val="17"/>
-          <w:lang w:val="it-IT"/>
-        </w:rPr>
-        <w:t>id_concorso</w:t>
-      </w:r>
-      <w:proofErr w:type="spellEnd"/>
-      <w:r>
-        <w:rPr>
-          <w:rFonts w:ascii="Courier New" w:hAnsi="Courier New"/>
-          <w:sz w:val="17"/>
-          <w:lang w:val="it-IT"/>
-        </w:rPr>
-        <w:t xml:space="preserve"> PK, classifica, </w:t>
-      </w:r>
-      <w:proofErr w:type="spellStart"/>
-      <w:r>
-        <w:rPr>
-          <w:rFonts w:ascii="Courier New" w:hAnsi="Courier New"/>
-          <w:sz w:val="17"/>
-          <w:lang w:val="it-IT"/>
-        </w:rPr>
-        <w:t>numero_giudici</w:t>
-      </w:r>
-      <w:proofErr w:type="spellEnd"/>
-      <w:r>
-        <w:rPr>
-          <w:rFonts w:ascii="Courier New" w:hAnsi="Courier New"/>
-          <w:sz w:val="17"/>
-          <w:lang w:val="it-IT"/>
-        </w:rPr>
-        <w:t>)</w:t>
-      </w:r>
-    </w:p>
-    <w:p>
-      <w:pPr>
-        <w:rPr>
-          <w:lang w:val="it-IT"/>
-        </w:rPr>
-      </w:pPr>
-      <w:r>
-        <w:rPr>
-          <w:rFonts w:ascii="Courier New" w:hAnsi="Courier New"/>
-          <w:sz w:val="17"/>
-          <w:lang w:val="it-IT"/>
-        </w:rPr>
-        <w:t>ISCRIZIONE_</w:t>
-      </w:r>
-      <w:proofErr w:type="gramStart"/>
-      <w:r>
-        <w:rPr>
-          <w:rFonts w:ascii="Courier New" w:hAnsi="Courier New"/>
-          <w:sz w:val="17"/>
-          <w:lang w:val="it-IT"/>
-        </w:rPr>
-        <w:t>COMPETIZIONE(</w:t>
-      </w:r>
-      <w:proofErr w:type="spellStart"/>
-      <w:proofErr w:type="gramEnd"/>
-      <w:r>
-        <w:rPr>
-          <w:rFonts w:ascii="Courier New" w:hAnsi="Courier New"/>
-          <w:sz w:val="17"/>
-          <w:lang w:val="it-IT"/>
-        </w:rPr>
-        <w:t>id_iscrizione</w:t>
-      </w:r>
-      <w:proofErr w:type="spellEnd"/>
-      <w:r>
-        <w:rPr>
-          <w:rFonts w:ascii="Courier New" w:hAnsi="Courier New"/>
-          <w:sz w:val="17"/>
-          <w:lang w:val="it-IT"/>
-        </w:rPr>
-        <w:t xml:space="preserve"> PK, </w:t>
-      </w:r>
-      <w:proofErr w:type="spellStart"/>
-      <w:r>
-        <w:rPr>
-          <w:rFonts w:ascii="Courier New" w:hAnsi="Courier New"/>
-          <w:sz w:val="17"/>
-          <w:lang w:val="it-IT"/>
-        </w:rPr>
-        <w:t>id_allieva</w:t>
-      </w:r>
-      <w:proofErr w:type="spellEnd"/>
-      <w:r>
-        <w:rPr>
-          <w:rFonts w:ascii="Courier New" w:hAnsi="Courier New"/>
-          <w:sz w:val="17"/>
-          <w:lang w:val="it-IT"/>
-        </w:rPr>
-        <w:t xml:space="preserve"> FK -&gt; ALLIEVA, </w:t>
-      </w:r>
-      <w:proofErr w:type="spellStart"/>
-      <w:r>
-        <w:rPr>
-          <w:rFonts w:ascii="Courier New" w:hAnsi="Courier New"/>
-          <w:sz w:val="17"/>
-          <w:lang w:val="it-IT"/>
-        </w:rPr>
-        <w:t>id_concorso</w:t>
-      </w:r>
-      <w:proofErr w:type="spellEnd"/>
-      <w:r>
-        <w:rPr>
-          <w:rFonts w:ascii="Courier New" w:hAnsi="Courier New"/>
-          <w:sz w:val="17"/>
-          <w:lang w:val="it-IT"/>
-        </w:rPr>
-        <w:t xml:space="preserve"> FK -&gt; COMPETIZIONE)</w:t>
-      </w:r>
-    </w:p>
-    <w:p>
-      <w:pPr>
-        <w:pStyle w:val="Titolo1"/>
-        <w:rPr>
-          <w:sz w:val="26"/>
-          <w:szCs w:val="26"/>
-          <w:lang w:val="it-IT"/>
-        </w:rPr>
-      </w:pPr>
-      <w:r>
-        <w:rPr>
-          <w:sz w:val="26"/>
-          <w:szCs w:val="26"/>
-          <w:lang w:val="it-IT"/>
-        </w:rPr>
-        <w:t xml:space="preserve">9. </w:t>
-      </w:r>
-      <w:r>
-        <w:rPr>
-          <w:sz w:val="26"/>
-          <w:szCs w:val="26"/>
-          <w:lang w:val="it-IT"/>
-        </w:rPr>
-        <w:t>Normalizzazione dello schema</w:t>
-      </w:r>
-    </w:p>
-    <w:p>
-      <w:pPr>
-        <w:rPr>
-          <w:lang w:val="it-IT"/>
-        </w:rPr>
-      </w:pPr>
-      <w:r>
-        <w:rPr>
-          <w:lang w:val="it-IT"/>
-        </w:rPr>
-        <w:t>Lo schema progettato è stato definito seguendo i principi della normalizzazione al fine di ridurre la ridondanza dei dati e prevenire anomalie di aggiornamento.</w:t>
-      </w:r>
-    </w:p>
-    <w:p>
-      <w:pPr>
-        <w:rPr>
-          <w:lang w:val="it-IT"/>
-        </w:rPr>
-      </w:pPr>
-      <w:r>
-        <w:rPr>
-          <w:lang w:val="it-IT"/>
-        </w:rPr>
-        <w:t>• Prima Forma Normale (1NF): tutte le tabelle contengono attributi atomici e non sono presenti gruppi ripetuti.</w:t>
-      </w:r>
-    </w:p>
-    <w:p>
-      <w:pPr>
-        <w:rPr>
-          <w:lang w:val="it-IT"/>
-        </w:rPr>
-      </w:pPr>
-      <w:r>
-        <w:rPr>
-          <w:lang w:val="it-IT"/>
-        </w:rPr>
-        <w:t>• Seconda Forma Normale (2NF): tutti gli attributi non chiave dipendono interamente dalla chiave primaria della rispettiva tabella.</w:t>
-      </w:r>
-    </w:p>
-    <w:p>
-      <w:pPr>
-        <w:rPr>
-          <w:lang w:val="it-IT"/>
-        </w:rPr>
-      </w:pPr>
-      <w:r>
-        <w:rPr>
-          <w:lang w:val="it-IT"/>
-        </w:rPr>
-        <w:t>• Terza Forma Normale (3NF): non sono presenti dipendenze transitive tra attributi non chiave; ogni attributo dipende esclusivamente dalla chiave primaria.</w:t>
-      </w:r>
-    </w:p>
-    <w:p>
-      <w:pPr>
-        <w:rPr>
-          <w:lang w:val="it-IT"/>
-        </w:rPr>
-      </w:pPr>
-      <w:r>
-        <w:rPr>
-          <w:lang w:val="it-IT"/>
-        </w:rPr>
-        <w:t>Di conseguenza, lo schema relazionale ottenuto può essere considerato conforme alla Terza Forma Normale (3NF), garantendo una buona organizzazione dei dati e una corretta gestione delle operazioni di inserimento, modifica e cancellazione.</w:t>
-      </w:r>
-    </w:p>
-    <w:p>
-      <w:pPr>
-        <w:rPr>
-          <w:lang w:val="it-IT"/>
-        </w:rPr>
-      </w:pPr>
+          <w:b w:val="0"/>
+          <w:bCs w:val="0"/>
+          <w:i/>
+          <w:iCs/>
+          <w:color w:val="auto"/>
+          <w:sz w:val="24"/>
+          <w:szCs w:val="24"/>
+          <w:lang w:val="it-IT"/>
+        </w:rPr>
+        <w:t>,</w:t>
+      </w:r>
+      <w:r>
+        <w:rPr>
+          <w:b w:val="0"/>
+          <w:bCs w:val="0"/>
+          <w:color w:val="auto"/>
+          <w:sz w:val="24"/>
+          <w:szCs w:val="24"/>
+          <w:lang w:val="it-IT"/>
+        </w:rPr>
+        <w:t xml:space="preserve"> ecc. Nell’implementazione tramite Django, invece, tali chiavi primarie sono generate automaticamente con il nome tecnico </w:t>
+      </w:r>
+      <w:r>
+        <w:rPr>
+          <w:b w:val="0"/>
+          <w:bCs w:val="0"/>
+          <w:i/>
+          <w:iCs/>
+          <w:color w:val="auto"/>
+          <w:sz w:val="24"/>
+          <w:szCs w:val="24"/>
+          <w:lang w:val="it-IT"/>
+        </w:rPr>
+        <w:t>id</w:t>
+      </w:r>
+      <w:r>
+        <w:rPr>
+          <w:b w:val="0"/>
+          <w:bCs w:val="0"/>
+          <w:color w:val="auto"/>
+          <w:sz w:val="24"/>
+          <w:szCs w:val="24"/>
+          <w:lang w:val="it-IT"/>
+        </w:rPr>
+        <w:t>, che corrisponde agli identificativi logici indicati nello schema</w:t>
+      </w:r>
     </w:p>
     <w:p>
       <w:pPr>
@@ -6257,6 +5632,7 @@
     <w:p>
       <w:pPr>
         <w:pStyle w:val="Titolo1"/>
+        <w:spacing w:before="0"/>
         <w:rPr>
           <w:lang w:val="it-IT"/>
         </w:rPr>
@@ -6265,14 +5641,13 @@
         <w:rPr>
           <w:lang w:val="it-IT"/>
         </w:rPr>
-        <w:lastRenderedPageBreak/>
-        <w:t>10</w:t>
-      </w:r>
-      <w:r>
-        <w:rPr>
-          <w:lang w:val="it-IT"/>
-        </w:rPr>
-        <w:t>. Vincoli del sistema e trigger</w:t>
+        <w:t>8</w:t>
+      </w:r>
+      <w:r>
+        <w:rPr>
+          <w:lang w:val="it-IT"/>
+        </w:rPr>
+        <w:t>. Schema logico relazionale</w:t>
       </w:r>
     </w:p>
     <w:p>
@@ -6287,6 +5662,1199 @@
           <w:sz w:val="21"/>
           <w:lang w:val="it-IT"/>
         </w:rPr>
+        <w:t>Di seguito è riportato lo schema logico relazionale. In questa fase vengono indicate esplicitamente chiavi primarie e chiavi esterne.</w:t>
+      </w:r>
+    </w:p>
+    <w:p>
+      <w:pPr>
+        <w:rPr>
+          <w:lang w:val="it-IT"/>
+        </w:rPr>
+      </w:pPr>
+      <w:proofErr w:type="gramStart"/>
+      <w:r>
+        <w:rPr>
+          <w:rFonts w:ascii="Courier New" w:eastAsia="Courier New" w:hAnsi="Courier New"/>
+          <w:sz w:val="17"/>
+          <w:lang w:val="it-IT"/>
+        </w:rPr>
+        <w:t>MAESTRA(</w:t>
+      </w:r>
+      <w:proofErr w:type="spellStart"/>
+      <w:proofErr w:type="gramEnd"/>
+      <w:r>
+        <w:rPr>
+          <w:rFonts w:ascii="Courier New" w:eastAsia="Courier New" w:hAnsi="Courier New"/>
+          <w:sz w:val="17"/>
+          <w:lang w:val="it-IT"/>
+        </w:rPr>
+        <w:t>id_maestra</w:t>
+      </w:r>
+      <w:proofErr w:type="spellEnd"/>
+      <w:r>
+        <w:rPr>
+          <w:rFonts w:ascii="Courier New" w:eastAsia="Courier New" w:hAnsi="Courier New"/>
+          <w:sz w:val="17"/>
+          <w:lang w:val="it-IT"/>
+        </w:rPr>
+        <w:t xml:space="preserve"> PK, nome, cognome, telefono, </w:t>
+      </w:r>
+      <w:proofErr w:type="gramStart"/>
+      <w:r>
+        <w:rPr>
+          <w:rFonts w:ascii="Courier New" w:eastAsia="Courier New" w:hAnsi="Courier New"/>
+          <w:sz w:val="17"/>
+          <w:lang w:val="it-IT"/>
+        </w:rPr>
+        <w:t>email</w:t>
+      </w:r>
+      <w:proofErr w:type="gramEnd"/>
+      <w:r>
+        <w:rPr>
+          <w:rFonts w:ascii="Courier New" w:eastAsia="Courier New" w:hAnsi="Courier New"/>
+          <w:sz w:val="17"/>
+          <w:lang w:val="it-IT"/>
+        </w:rPr>
+        <w:t xml:space="preserve">, specializzazione, </w:t>
+      </w:r>
+      <w:proofErr w:type="spellStart"/>
+      <w:r>
+        <w:rPr>
+          <w:rFonts w:ascii="Courier New" w:eastAsia="Courier New" w:hAnsi="Courier New"/>
+          <w:sz w:val="17"/>
+          <w:lang w:val="it-IT"/>
+        </w:rPr>
+        <w:t>compenso_mensile</w:t>
+      </w:r>
+      <w:proofErr w:type="spellEnd"/>
+      <w:r>
+        <w:rPr>
+          <w:rFonts w:ascii="Courier New" w:eastAsia="Courier New" w:hAnsi="Courier New"/>
+          <w:sz w:val="17"/>
+          <w:lang w:val="it-IT"/>
+        </w:rPr>
+        <w:t>)</w:t>
+      </w:r>
+    </w:p>
+    <w:p>
+      <w:pPr>
+        <w:rPr>
+          <w:lang w:val="it-IT"/>
+        </w:rPr>
+      </w:pPr>
+      <w:proofErr w:type="gramStart"/>
+      <w:r>
+        <w:rPr>
+          <w:rFonts w:ascii="Courier New" w:eastAsia="Courier New" w:hAnsi="Courier New"/>
+          <w:sz w:val="17"/>
+          <w:lang w:val="it-IT"/>
+        </w:rPr>
+        <w:t>CORSO(</w:t>
+      </w:r>
+      <w:proofErr w:type="spellStart"/>
+      <w:proofErr w:type="gramEnd"/>
+      <w:r>
+        <w:rPr>
+          <w:rFonts w:ascii="Courier New" w:eastAsia="Courier New" w:hAnsi="Courier New"/>
+          <w:sz w:val="17"/>
+          <w:lang w:val="it-IT"/>
+        </w:rPr>
+        <w:t>id_corso</w:t>
+      </w:r>
+      <w:proofErr w:type="spellEnd"/>
+      <w:r>
+        <w:rPr>
+          <w:rFonts w:ascii="Courier New" w:eastAsia="Courier New" w:hAnsi="Courier New"/>
+          <w:sz w:val="17"/>
+          <w:lang w:val="it-IT"/>
+        </w:rPr>
+        <w:t xml:space="preserve"> PK, nome, livello, </w:t>
+      </w:r>
+      <w:proofErr w:type="spellStart"/>
+      <w:r>
+        <w:rPr>
+          <w:rFonts w:ascii="Courier New" w:eastAsia="Courier New" w:hAnsi="Courier New"/>
+          <w:sz w:val="17"/>
+          <w:lang w:val="it-IT"/>
+        </w:rPr>
+        <w:t>fascia_eta</w:t>
+      </w:r>
+      <w:proofErr w:type="spellEnd"/>
+      <w:r>
+        <w:rPr>
+          <w:rFonts w:ascii="Courier New" w:eastAsia="Courier New" w:hAnsi="Courier New"/>
+          <w:sz w:val="17"/>
+          <w:lang w:val="it-IT"/>
+        </w:rPr>
+        <w:t xml:space="preserve">, </w:t>
+      </w:r>
+      <w:proofErr w:type="spellStart"/>
+      <w:r>
+        <w:rPr>
+          <w:rFonts w:ascii="Courier New" w:eastAsia="Courier New" w:hAnsi="Courier New"/>
+          <w:sz w:val="17"/>
+          <w:lang w:val="it-IT"/>
+        </w:rPr>
+        <w:t>id_maestra</w:t>
+      </w:r>
+      <w:proofErr w:type="spellEnd"/>
+      <w:r>
+        <w:rPr>
+          <w:rFonts w:ascii="Courier New" w:eastAsia="Courier New" w:hAnsi="Courier New"/>
+          <w:sz w:val="17"/>
+          <w:lang w:val="it-IT"/>
+        </w:rPr>
+        <w:t xml:space="preserve"> FK -&gt; MAESTRA)</w:t>
+      </w:r>
+    </w:p>
+    <w:p>
+      <w:pPr>
+        <w:rPr>
+          <w:lang w:val="it-IT"/>
+        </w:rPr>
+      </w:pPr>
+      <w:proofErr w:type="gramStart"/>
+      <w:r>
+        <w:rPr>
+          <w:rFonts w:ascii="Courier New" w:eastAsia="Courier New" w:hAnsi="Courier New"/>
+          <w:sz w:val="17"/>
+          <w:lang w:val="it-IT"/>
+        </w:rPr>
+        <w:t>ALLIEVA(</w:t>
+      </w:r>
+      <w:proofErr w:type="spellStart"/>
+      <w:proofErr w:type="gramEnd"/>
+      <w:r>
+        <w:rPr>
+          <w:rFonts w:ascii="Courier New" w:eastAsia="Courier New" w:hAnsi="Courier New"/>
+          <w:sz w:val="17"/>
+          <w:lang w:val="it-IT"/>
+        </w:rPr>
+        <w:t>id_allieva</w:t>
+      </w:r>
+      <w:proofErr w:type="spellEnd"/>
+      <w:r>
+        <w:rPr>
+          <w:rFonts w:ascii="Courier New" w:eastAsia="Courier New" w:hAnsi="Courier New"/>
+          <w:sz w:val="17"/>
+          <w:lang w:val="it-IT"/>
+        </w:rPr>
+        <w:t xml:space="preserve"> PK, nome, cognome, </w:t>
+      </w:r>
+      <w:proofErr w:type="spellStart"/>
+      <w:r>
+        <w:rPr>
+          <w:rFonts w:ascii="Courier New" w:eastAsia="Courier New" w:hAnsi="Courier New"/>
+          <w:sz w:val="17"/>
+          <w:lang w:val="it-IT"/>
+        </w:rPr>
+        <w:t>data_nascita</w:t>
+      </w:r>
+      <w:proofErr w:type="spellEnd"/>
+      <w:r>
+        <w:rPr>
+          <w:rFonts w:ascii="Courier New" w:eastAsia="Courier New" w:hAnsi="Courier New"/>
+          <w:sz w:val="17"/>
+          <w:lang w:val="it-IT"/>
+        </w:rPr>
+        <w:t xml:space="preserve">, telefono, </w:t>
+      </w:r>
+      <w:proofErr w:type="gramStart"/>
+      <w:r>
+        <w:rPr>
+          <w:rFonts w:ascii="Courier New" w:eastAsia="Courier New" w:hAnsi="Courier New"/>
+          <w:sz w:val="17"/>
+          <w:lang w:val="it-IT"/>
+        </w:rPr>
+        <w:t>email</w:t>
+      </w:r>
+      <w:proofErr w:type="gramEnd"/>
+      <w:r>
+        <w:rPr>
+          <w:rFonts w:ascii="Courier New" w:eastAsia="Courier New" w:hAnsi="Courier New"/>
+          <w:sz w:val="17"/>
+          <w:lang w:val="it-IT"/>
+        </w:rPr>
+        <w:t xml:space="preserve">, </w:t>
+      </w:r>
+      <w:proofErr w:type="spellStart"/>
+      <w:r>
+        <w:rPr>
+          <w:rFonts w:ascii="Courier New" w:eastAsia="Courier New" w:hAnsi="Courier New"/>
+          <w:sz w:val="17"/>
+          <w:lang w:val="it-IT"/>
+        </w:rPr>
+        <w:t>data_iscrizione</w:t>
+      </w:r>
+      <w:proofErr w:type="spellEnd"/>
+      <w:r>
+        <w:rPr>
+          <w:rFonts w:ascii="Courier New" w:eastAsia="Courier New" w:hAnsi="Courier New"/>
+          <w:sz w:val="17"/>
+          <w:lang w:val="it-IT"/>
+        </w:rPr>
+        <w:t xml:space="preserve">, </w:t>
+      </w:r>
+      <w:proofErr w:type="spellStart"/>
+      <w:r>
+        <w:rPr>
+          <w:rFonts w:ascii="Courier New" w:eastAsia="Courier New" w:hAnsi="Courier New"/>
+          <w:sz w:val="17"/>
+          <w:lang w:val="it-IT"/>
+        </w:rPr>
+        <w:t>certificato_medico</w:t>
+      </w:r>
+      <w:proofErr w:type="spellEnd"/>
+      <w:r>
+        <w:rPr>
+          <w:rFonts w:ascii="Courier New" w:eastAsia="Courier New" w:hAnsi="Courier New"/>
+          <w:sz w:val="17"/>
+          <w:lang w:val="it-IT"/>
+        </w:rPr>
+        <w:t xml:space="preserve">, </w:t>
+      </w:r>
+      <w:proofErr w:type="spellStart"/>
+      <w:r>
+        <w:rPr>
+          <w:rFonts w:ascii="Courier New" w:eastAsia="Courier New" w:hAnsi="Courier New"/>
+          <w:sz w:val="17"/>
+          <w:lang w:val="it-IT"/>
+        </w:rPr>
+        <w:t>id_corso</w:t>
+      </w:r>
+      <w:proofErr w:type="spellEnd"/>
+      <w:r>
+        <w:rPr>
+          <w:rFonts w:ascii="Courier New" w:eastAsia="Courier New" w:hAnsi="Courier New"/>
+          <w:sz w:val="17"/>
+          <w:lang w:val="it-IT"/>
+        </w:rPr>
+        <w:t xml:space="preserve"> FK -&gt; CORSO)</w:t>
+      </w:r>
+    </w:p>
+    <w:p>
+      <w:pPr>
+        <w:rPr>
+          <w:lang w:val="it-IT"/>
+        </w:rPr>
+      </w:pPr>
+      <w:proofErr w:type="gramStart"/>
+      <w:r>
+        <w:rPr>
+          <w:rFonts w:ascii="Courier New" w:eastAsia="Courier New" w:hAnsi="Courier New"/>
+          <w:sz w:val="17"/>
+          <w:lang w:val="it-IT"/>
+        </w:rPr>
+        <w:t>LEZIONE(</w:t>
+      </w:r>
+      <w:proofErr w:type="spellStart"/>
+      <w:proofErr w:type="gramEnd"/>
+      <w:r>
+        <w:rPr>
+          <w:rFonts w:ascii="Courier New" w:eastAsia="Courier New" w:hAnsi="Courier New"/>
+          <w:sz w:val="17"/>
+          <w:lang w:val="it-IT"/>
+        </w:rPr>
+        <w:t>id_lezione</w:t>
+      </w:r>
+      <w:proofErr w:type="spellEnd"/>
+      <w:r>
+        <w:rPr>
+          <w:rFonts w:ascii="Courier New" w:eastAsia="Courier New" w:hAnsi="Courier New"/>
+          <w:sz w:val="17"/>
+          <w:lang w:val="it-IT"/>
+        </w:rPr>
+        <w:t xml:space="preserve"> PK, </w:t>
+      </w:r>
+      <w:proofErr w:type="spellStart"/>
+      <w:r>
+        <w:rPr>
+          <w:rFonts w:ascii="Courier New" w:eastAsia="Courier New" w:hAnsi="Courier New"/>
+          <w:sz w:val="17"/>
+          <w:lang w:val="it-IT"/>
+        </w:rPr>
+        <w:t>giorno_settimana</w:t>
+      </w:r>
+      <w:proofErr w:type="spellEnd"/>
+      <w:r>
+        <w:rPr>
+          <w:rFonts w:ascii="Courier New" w:eastAsia="Courier New" w:hAnsi="Courier New"/>
+          <w:sz w:val="17"/>
+          <w:lang w:val="it-IT"/>
+        </w:rPr>
+        <w:t xml:space="preserve">, </w:t>
+      </w:r>
+      <w:proofErr w:type="spellStart"/>
+      <w:r>
+        <w:rPr>
+          <w:rFonts w:ascii="Courier New" w:eastAsia="Courier New" w:hAnsi="Courier New"/>
+          <w:sz w:val="17"/>
+          <w:lang w:val="it-IT"/>
+        </w:rPr>
+        <w:t>ora_inizio</w:t>
+      </w:r>
+      <w:proofErr w:type="spellEnd"/>
+      <w:r>
+        <w:rPr>
+          <w:rFonts w:ascii="Courier New" w:eastAsia="Courier New" w:hAnsi="Courier New"/>
+          <w:sz w:val="17"/>
+          <w:lang w:val="it-IT"/>
+        </w:rPr>
+        <w:t xml:space="preserve">, </w:t>
+      </w:r>
+      <w:proofErr w:type="spellStart"/>
+      <w:r>
+        <w:rPr>
+          <w:rFonts w:ascii="Courier New" w:eastAsia="Courier New" w:hAnsi="Courier New"/>
+          <w:sz w:val="17"/>
+          <w:lang w:val="it-IT"/>
+        </w:rPr>
+        <w:t>ora_fine</w:t>
+      </w:r>
+      <w:proofErr w:type="spellEnd"/>
+      <w:r>
+        <w:rPr>
+          <w:rFonts w:ascii="Courier New" w:eastAsia="Courier New" w:hAnsi="Courier New"/>
+          <w:sz w:val="17"/>
+          <w:lang w:val="it-IT"/>
+        </w:rPr>
+        <w:t xml:space="preserve">, sala, </w:t>
+      </w:r>
+      <w:proofErr w:type="spellStart"/>
+      <w:r>
+        <w:rPr>
+          <w:rFonts w:ascii="Courier New" w:eastAsia="Courier New" w:hAnsi="Courier New"/>
+          <w:sz w:val="17"/>
+          <w:lang w:val="it-IT"/>
+        </w:rPr>
+        <w:t>id_corso</w:t>
+      </w:r>
+      <w:proofErr w:type="spellEnd"/>
+      <w:r>
+        <w:rPr>
+          <w:rFonts w:ascii="Courier New" w:eastAsia="Courier New" w:hAnsi="Courier New"/>
+          <w:sz w:val="17"/>
+          <w:lang w:val="it-IT"/>
+        </w:rPr>
+        <w:t xml:space="preserve"> FK -&gt; CORSO, </w:t>
+      </w:r>
+      <w:proofErr w:type="spellStart"/>
+      <w:r>
+        <w:rPr>
+          <w:rFonts w:ascii="Courier New" w:eastAsia="Courier New" w:hAnsi="Courier New"/>
+          <w:sz w:val="17"/>
+          <w:lang w:val="it-IT"/>
+        </w:rPr>
+        <w:t>id_maestra</w:t>
+      </w:r>
+      <w:proofErr w:type="spellEnd"/>
+      <w:r>
+        <w:rPr>
+          <w:rFonts w:ascii="Courier New" w:eastAsia="Courier New" w:hAnsi="Courier New"/>
+          <w:sz w:val="17"/>
+          <w:lang w:val="it-IT"/>
+        </w:rPr>
+        <w:t xml:space="preserve"> FK -&gt; MAESTRA)</w:t>
+      </w:r>
+    </w:p>
+    <w:p>
+      <w:pPr>
+        <w:rPr>
+          <w:lang w:val="it-IT"/>
+        </w:rPr>
+      </w:pPr>
+      <w:r>
+        <w:rPr>
+          <w:rFonts w:ascii="Courier New" w:eastAsia="Courier New" w:hAnsi="Courier New"/>
+          <w:sz w:val="17"/>
+          <w:lang w:val="it-IT"/>
+        </w:rPr>
+        <w:t>PAGAMENTO_</w:t>
+      </w:r>
+      <w:proofErr w:type="gramStart"/>
+      <w:r>
+        <w:rPr>
+          <w:rFonts w:ascii="Courier New" w:eastAsia="Courier New" w:hAnsi="Courier New"/>
+          <w:sz w:val="17"/>
+          <w:lang w:val="it-IT"/>
+        </w:rPr>
+        <w:t>ALLIEVA(</w:t>
+      </w:r>
+      <w:proofErr w:type="spellStart"/>
+      <w:proofErr w:type="gramEnd"/>
+      <w:r>
+        <w:rPr>
+          <w:rFonts w:ascii="Courier New" w:eastAsia="Courier New" w:hAnsi="Courier New"/>
+          <w:sz w:val="17"/>
+          <w:lang w:val="it-IT"/>
+        </w:rPr>
+        <w:t>id_pagamento</w:t>
+      </w:r>
+      <w:proofErr w:type="spellEnd"/>
+      <w:r>
+        <w:rPr>
+          <w:rFonts w:ascii="Courier New" w:eastAsia="Courier New" w:hAnsi="Courier New"/>
+          <w:sz w:val="17"/>
+          <w:lang w:val="it-IT"/>
+        </w:rPr>
+        <w:t xml:space="preserve"> PK, </w:t>
+      </w:r>
+      <w:proofErr w:type="spellStart"/>
+      <w:r>
+        <w:rPr>
+          <w:rFonts w:ascii="Courier New" w:eastAsia="Courier New" w:hAnsi="Courier New"/>
+          <w:sz w:val="17"/>
+          <w:lang w:val="it-IT"/>
+        </w:rPr>
+        <w:t>id_allieva</w:t>
+      </w:r>
+      <w:proofErr w:type="spellEnd"/>
+      <w:r>
+        <w:rPr>
+          <w:rFonts w:ascii="Courier New" w:eastAsia="Courier New" w:hAnsi="Courier New"/>
+          <w:sz w:val="17"/>
+          <w:lang w:val="it-IT"/>
+        </w:rPr>
+        <w:t xml:space="preserve"> FK -&gt; ALLIEVA, importo, </w:t>
+      </w:r>
+      <w:proofErr w:type="spellStart"/>
+      <w:r>
+        <w:rPr>
+          <w:rFonts w:ascii="Courier New" w:eastAsia="Courier New" w:hAnsi="Courier New"/>
+          <w:sz w:val="17"/>
+          <w:lang w:val="it-IT"/>
+        </w:rPr>
+        <w:t>data_scadenza</w:t>
+      </w:r>
+      <w:proofErr w:type="spellEnd"/>
+      <w:r>
+        <w:rPr>
+          <w:rFonts w:ascii="Courier New" w:eastAsia="Courier New" w:hAnsi="Courier New"/>
+          <w:sz w:val="17"/>
+          <w:lang w:val="it-IT"/>
+        </w:rPr>
+        <w:t xml:space="preserve">, </w:t>
+      </w:r>
+      <w:proofErr w:type="spellStart"/>
+      <w:r>
+        <w:rPr>
+          <w:rFonts w:ascii="Courier New" w:eastAsia="Courier New" w:hAnsi="Courier New"/>
+          <w:sz w:val="17"/>
+          <w:lang w:val="it-IT"/>
+        </w:rPr>
+        <w:t>data_pagamento</w:t>
+      </w:r>
+      <w:proofErr w:type="spellEnd"/>
+      <w:r>
+        <w:rPr>
+          <w:rFonts w:ascii="Courier New" w:eastAsia="Courier New" w:hAnsi="Courier New"/>
+          <w:sz w:val="17"/>
+          <w:lang w:val="it-IT"/>
+        </w:rPr>
+        <w:t>, stato, descrizione)</w:t>
+      </w:r>
+    </w:p>
+    <w:p>
+      <w:pPr>
+        <w:rPr>
+          <w:lang w:val="it-IT"/>
+        </w:rPr>
+      </w:pPr>
+      <w:r>
+        <w:rPr>
+          <w:rFonts w:ascii="Courier New" w:eastAsia="Courier New" w:hAnsi="Courier New"/>
+          <w:sz w:val="17"/>
+          <w:lang w:val="it-IT"/>
+        </w:rPr>
+        <w:t>PAGAMENTO_</w:t>
+      </w:r>
+      <w:proofErr w:type="gramStart"/>
+      <w:r>
+        <w:rPr>
+          <w:rFonts w:ascii="Courier New" w:eastAsia="Courier New" w:hAnsi="Courier New"/>
+          <w:sz w:val="17"/>
+          <w:lang w:val="it-IT"/>
+        </w:rPr>
+        <w:t>MAESTRA(</w:t>
+      </w:r>
+      <w:proofErr w:type="spellStart"/>
+      <w:proofErr w:type="gramEnd"/>
+      <w:r>
+        <w:rPr>
+          <w:rFonts w:ascii="Courier New" w:eastAsia="Courier New" w:hAnsi="Courier New"/>
+          <w:sz w:val="17"/>
+          <w:lang w:val="it-IT"/>
+        </w:rPr>
+        <w:t>id_pagamento</w:t>
+      </w:r>
+      <w:proofErr w:type="spellEnd"/>
+      <w:r>
+        <w:rPr>
+          <w:rFonts w:ascii="Courier New" w:eastAsia="Courier New" w:hAnsi="Courier New"/>
+          <w:sz w:val="17"/>
+          <w:lang w:val="it-IT"/>
+        </w:rPr>
+        <w:t xml:space="preserve"> PK, </w:t>
+      </w:r>
+      <w:proofErr w:type="spellStart"/>
+      <w:r>
+        <w:rPr>
+          <w:rFonts w:ascii="Courier New" w:eastAsia="Courier New" w:hAnsi="Courier New"/>
+          <w:sz w:val="17"/>
+          <w:lang w:val="it-IT"/>
+        </w:rPr>
+        <w:t>id_maestra</w:t>
+      </w:r>
+      <w:proofErr w:type="spellEnd"/>
+      <w:r>
+        <w:rPr>
+          <w:rFonts w:ascii="Courier New" w:eastAsia="Courier New" w:hAnsi="Courier New"/>
+          <w:sz w:val="17"/>
+          <w:lang w:val="it-IT"/>
+        </w:rPr>
+        <w:t xml:space="preserve"> FK -&gt; MAESTRA, importo, </w:t>
+      </w:r>
+      <w:proofErr w:type="spellStart"/>
+      <w:r>
+        <w:rPr>
+          <w:rFonts w:ascii="Courier New" w:eastAsia="Courier New" w:hAnsi="Courier New"/>
+          <w:sz w:val="17"/>
+          <w:lang w:val="it-IT"/>
+        </w:rPr>
+        <w:t>data_scadenza</w:t>
+      </w:r>
+      <w:proofErr w:type="spellEnd"/>
+      <w:r>
+        <w:rPr>
+          <w:rFonts w:ascii="Courier New" w:eastAsia="Courier New" w:hAnsi="Courier New"/>
+          <w:sz w:val="17"/>
+          <w:lang w:val="it-IT"/>
+        </w:rPr>
+        <w:t xml:space="preserve">, </w:t>
+      </w:r>
+      <w:proofErr w:type="spellStart"/>
+      <w:r>
+        <w:rPr>
+          <w:rFonts w:ascii="Courier New" w:eastAsia="Courier New" w:hAnsi="Courier New"/>
+          <w:sz w:val="17"/>
+          <w:lang w:val="it-IT"/>
+        </w:rPr>
+        <w:t>data_pagamento</w:t>
+      </w:r>
+      <w:proofErr w:type="spellEnd"/>
+      <w:r>
+        <w:rPr>
+          <w:rFonts w:ascii="Courier New" w:eastAsia="Courier New" w:hAnsi="Courier New"/>
+          <w:sz w:val="17"/>
+          <w:lang w:val="it-IT"/>
+        </w:rPr>
+        <w:t>, stato, descrizione)</w:t>
+      </w:r>
+    </w:p>
+    <w:p>
+      <w:pPr>
+        <w:rPr>
+          <w:lang w:val="it-IT"/>
+        </w:rPr>
+      </w:pPr>
+      <w:proofErr w:type="gramStart"/>
+      <w:r>
+        <w:rPr>
+          <w:rFonts w:ascii="Courier New" w:eastAsia="Courier New" w:hAnsi="Courier New"/>
+          <w:sz w:val="17"/>
+          <w:lang w:val="it-IT"/>
+        </w:rPr>
+        <w:t>SAGGIO(</w:t>
+      </w:r>
+      <w:proofErr w:type="spellStart"/>
+      <w:proofErr w:type="gramEnd"/>
+      <w:r>
+        <w:rPr>
+          <w:rFonts w:ascii="Courier New" w:eastAsia="Courier New" w:hAnsi="Courier New"/>
+          <w:sz w:val="17"/>
+          <w:lang w:val="it-IT"/>
+        </w:rPr>
+        <w:t>id_saggio</w:t>
+      </w:r>
+      <w:proofErr w:type="spellEnd"/>
+      <w:r>
+        <w:rPr>
+          <w:rFonts w:ascii="Courier New" w:eastAsia="Courier New" w:hAnsi="Courier New"/>
+          <w:sz w:val="17"/>
+          <w:lang w:val="it-IT"/>
+        </w:rPr>
+        <w:t xml:space="preserve"> PK, titolo, data, luogo, </w:t>
+      </w:r>
+      <w:proofErr w:type="spellStart"/>
+      <w:r>
+        <w:rPr>
+          <w:rFonts w:ascii="Courier New" w:eastAsia="Courier New" w:hAnsi="Courier New"/>
+          <w:sz w:val="17"/>
+          <w:lang w:val="it-IT"/>
+        </w:rPr>
+        <w:t>ora_inizio</w:t>
+      </w:r>
+      <w:proofErr w:type="spellEnd"/>
+      <w:r>
+        <w:rPr>
+          <w:rFonts w:ascii="Courier New" w:eastAsia="Courier New" w:hAnsi="Courier New"/>
+          <w:sz w:val="17"/>
+          <w:lang w:val="it-IT"/>
+        </w:rPr>
+        <w:t xml:space="preserve">, stato, </w:t>
+      </w:r>
+      <w:proofErr w:type="spellStart"/>
+      <w:r>
+        <w:rPr>
+          <w:rFonts w:ascii="Courier New" w:eastAsia="Courier New" w:hAnsi="Courier New"/>
+          <w:sz w:val="17"/>
+          <w:lang w:val="it-IT"/>
+        </w:rPr>
+        <w:t>numero_atti</w:t>
+      </w:r>
+      <w:proofErr w:type="spellEnd"/>
+      <w:r>
+        <w:rPr>
+          <w:rFonts w:ascii="Courier New" w:eastAsia="Courier New" w:hAnsi="Courier New"/>
+          <w:sz w:val="17"/>
+          <w:lang w:val="it-IT"/>
+        </w:rPr>
+        <w:t xml:space="preserve">, </w:t>
+      </w:r>
+      <w:proofErr w:type="spellStart"/>
+      <w:r>
+        <w:rPr>
+          <w:rFonts w:ascii="Courier New" w:eastAsia="Courier New" w:hAnsi="Courier New"/>
+          <w:sz w:val="17"/>
+          <w:lang w:val="it-IT"/>
+        </w:rPr>
+        <w:t>durata_totale</w:t>
+      </w:r>
+      <w:proofErr w:type="spellEnd"/>
+      <w:r>
+        <w:rPr>
+          <w:rFonts w:ascii="Courier New" w:eastAsia="Courier New" w:hAnsi="Courier New"/>
+          <w:sz w:val="17"/>
+          <w:lang w:val="it-IT"/>
+        </w:rPr>
+        <w:t>)</w:t>
+      </w:r>
+    </w:p>
+    <w:p>
+      <w:pPr>
+        <w:rPr>
+          <w:lang w:val="it-IT"/>
+        </w:rPr>
+      </w:pPr>
+      <w:proofErr w:type="gramStart"/>
+      <w:r>
+        <w:rPr>
+          <w:rFonts w:ascii="Courier New" w:eastAsia="Courier New" w:hAnsi="Courier New"/>
+          <w:sz w:val="17"/>
+          <w:lang w:val="it-IT"/>
+        </w:rPr>
+        <w:t>COREOGRAFIA(</w:t>
+      </w:r>
+      <w:proofErr w:type="spellStart"/>
+      <w:proofErr w:type="gramEnd"/>
+      <w:r>
+        <w:rPr>
+          <w:rFonts w:ascii="Courier New" w:eastAsia="Courier New" w:hAnsi="Courier New"/>
+          <w:sz w:val="17"/>
+          <w:lang w:val="it-IT"/>
+        </w:rPr>
+        <w:t>id_coreografia</w:t>
+      </w:r>
+      <w:proofErr w:type="spellEnd"/>
+      <w:r>
+        <w:rPr>
+          <w:rFonts w:ascii="Courier New" w:eastAsia="Courier New" w:hAnsi="Courier New"/>
+          <w:sz w:val="17"/>
+          <w:lang w:val="it-IT"/>
+        </w:rPr>
+        <w:t xml:space="preserve"> PK, nome, </w:t>
+      </w:r>
+      <w:proofErr w:type="spellStart"/>
+      <w:r>
+        <w:rPr>
+          <w:rFonts w:ascii="Courier New" w:eastAsia="Courier New" w:hAnsi="Courier New"/>
+          <w:sz w:val="17"/>
+          <w:lang w:val="it-IT"/>
+        </w:rPr>
+        <w:t>id_saggio</w:t>
+      </w:r>
+      <w:proofErr w:type="spellEnd"/>
+      <w:r>
+        <w:rPr>
+          <w:rFonts w:ascii="Courier New" w:eastAsia="Courier New" w:hAnsi="Courier New"/>
+          <w:sz w:val="17"/>
+          <w:lang w:val="it-IT"/>
+        </w:rPr>
+        <w:t xml:space="preserve"> FK -&gt; SAGGIO, </w:t>
+      </w:r>
+      <w:proofErr w:type="spellStart"/>
+      <w:r>
+        <w:rPr>
+          <w:rFonts w:ascii="Courier New" w:eastAsia="Courier New" w:hAnsi="Courier New"/>
+          <w:sz w:val="17"/>
+          <w:lang w:val="it-IT"/>
+        </w:rPr>
+        <w:t>id_corso</w:t>
+      </w:r>
+      <w:proofErr w:type="spellEnd"/>
+      <w:r>
+        <w:rPr>
+          <w:rFonts w:ascii="Courier New" w:eastAsia="Courier New" w:hAnsi="Courier New"/>
+          <w:sz w:val="17"/>
+          <w:lang w:val="it-IT"/>
+        </w:rPr>
+        <w:t xml:space="preserve"> FK -&gt; CORSO, </w:t>
+      </w:r>
+      <w:proofErr w:type="spellStart"/>
+      <w:r>
+        <w:rPr>
+          <w:rFonts w:ascii="Courier New" w:eastAsia="Courier New" w:hAnsi="Courier New"/>
+          <w:sz w:val="17"/>
+          <w:lang w:val="it-IT"/>
+        </w:rPr>
+        <w:t>id_maestra</w:t>
+      </w:r>
+      <w:proofErr w:type="spellEnd"/>
+      <w:r>
+        <w:rPr>
+          <w:rFonts w:ascii="Courier New" w:eastAsia="Courier New" w:hAnsi="Courier New"/>
+          <w:sz w:val="17"/>
+          <w:lang w:val="it-IT"/>
+        </w:rPr>
+        <w:t xml:space="preserve"> FK -&gt; MAESTRA, atto, </w:t>
+      </w:r>
+      <w:proofErr w:type="spellStart"/>
+      <w:r>
+        <w:rPr>
+          <w:rFonts w:ascii="Courier New" w:eastAsia="Courier New" w:hAnsi="Courier New"/>
+          <w:sz w:val="17"/>
+          <w:lang w:val="it-IT"/>
+        </w:rPr>
+        <w:t>ordine_uscita</w:t>
+      </w:r>
+      <w:proofErr w:type="spellEnd"/>
+      <w:r>
+        <w:rPr>
+          <w:rFonts w:ascii="Courier New" w:eastAsia="Courier New" w:hAnsi="Courier New"/>
+          <w:sz w:val="17"/>
+          <w:lang w:val="it-IT"/>
+        </w:rPr>
+        <w:t>, musica, durata)</w:t>
+      </w:r>
+    </w:p>
+    <w:p>
+      <w:pPr>
+        <w:rPr>
+          <w:lang w:val="it-IT"/>
+        </w:rPr>
+      </w:pPr>
+      <w:proofErr w:type="gramStart"/>
+      <w:r>
+        <w:rPr>
+          <w:rFonts w:ascii="Courier New" w:eastAsia="Courier New" w:hAnsi="Courier New"/>
+          <w:sz w:val="17"/>
+          <w:lang w:val="it-IT"/>
+        </w:rPr>
+        <w:t>COSTUME(</w:t>
+      </w:r>
+      <w:proofErr w:type="spellStart"/>
+      <w:proofErr w:type="gramEnd"/>
+      <w:r>
+        <w:rPr>
+          <w:rFonts w:ascii="Courier New" w:eastAsia="Courier New" w:hAnsi="Courier New"/>
+          <w:sz w:val="17"/>
+          <w:lang w:val="it-IT"/>
+        </w:rPr>
+        <w:t>id_costume</w:t>
+      </w:r>
+      <w:proofErr w:type="spellEnd"/>
+      <w:r>
+        <w:rPr>
+          <w:rFonts w:ascii="Courier New" w:eastAsia="Courier New" w:hAnsi="Courier New"/>
+          <w:sz w:val="17"/>
+          <w:lang w:val="it-IT"/>
+        </w:rPr>
+        <w:t xml:space="preserve"> PK, nome, descrizione, taglia, prezzo, fornitore, </w:t>
+      </w:r>
+      <w:proofErr w:type="spellStart"/>
+      <w:r>
+        <w:rPr>
+          <w:rFonts w:ascii="Courier New" w:eastAsia="Courier New" w:hAnsi="Courier New"/>
+          <w:sz w:val="17"/>
+          <w:lang w:val="it-IT"/>
+        </w:rPr>
+        <w:t>stato_ordine</w:t>
+      </w:r>
+      <w:proofErr w:type="spellEnd"/>
+      <w:r>
+        <w:rPr>
+          <w:rFonts w:ascii="Courier New" w:eastAsia="Courier New" w:hAnsi="Courier New"/>
+          <w:sz w:val="17"/>
+          <w:lang w:val="it-IT"/>
+        </w:rPr>
+        <w:t>)</w:t>
+      </w:r>
+    </w:p>
+    <w:p>
+      <w:pPr>
+        <w:rPr>
+          <w:rFonts w:ascii="Courier New" w:eastAsia="Courier New" w:hAnsi="Courier New"/>
+          <w:sz w:val="17"/>
+          <w:lang w:val="it-IT"/>
+        </w:rPr>
+      </w:pPr>
+      <w:r>
+        <w:rPr>
+          <w:rFonts w:ascii="Courier New" w:eastAsia="Courier New" w:hAnsi="Courier New"/>
+          <w:sz w:val="17"/>
+          <w:lang w:val="it-IT"/>
+        </w:rPr>
+        <w:t>ASSEGNAZIONE_</w:t>
+      </w:r>
+      <w:proofErr w:type="gramStart"/>
+      <w:r>
+        <w:rPr>
+          <w:rFonts w:ascii="Courier New" w:eastAsia="Courier New" w:hAnsi="Courier New"/>
+          <w:sz w:val="17"/>
+          <w:lang w:val="it-IT"/>
+        </w:rPr>
+        <w:t>COSTUMI(</w:t>
+      </w:r>
+      <w:proofErr w:type="spellStart"/>
+      <w:proofErr w:type="gramEnd"/>
+      <w:r>
+        <w:rPr>
+          <w:rFonts w:ascii="Courier New" w:eastAsia="Courier New" w:hAnsi="Courier New"/>
+          <w:sz w:val="17"/>
+          <w:lang w:val="it-IT"/>
+        </w:rPr>
+        <w:t>id_assegnazione</w:t>
+      </w:r>
+      <w:proofErr w:type="spellEnd"/>
+      <w:r>
+        <w:rPr>
+          <w:rFonts w:ascii="Courier New" w:eastAsia="Courier New" w:hAnsi="Courier New"/>
+          <w:sz w:val="17"/>
+          <w:lang w:val="it-IT"/>
+        </w:rPr>
+        <w:t xml:space="preserve"> PK, </w:t>
+      </w:r>
+      <w:proofErr w:type="spellStart"/>
+      <w:r>
+        <w:rPr>
+          <w:rFonts w:ascii="Courier New" w:eastAsia="Courier New" w:hAnsi="Courier New"/>
+          <w:sz w:val="17"/>
+          <w:lang w:val="it-IT"/>
+        </w:rPr>
+        <w:t>id_allieva</w:t>
+      </w:r>
+      <w:proofErr w:type="spellEnd"/>
+      <w:r>
+        <w:rPr>
+          <w:rFonts w:ascii="Courier New" w:eastAsia="Courier New" w:hAnsi="Courier New"/>
+          <w:sz w:val="17"/>
+          <w:lang w:val="it-IT"/>
+        </w:rPr>
+        <w:t xml:space="preserve"> FK -&gt; ALLIEVA, </w:t>
+      </w:r>
+      <w:proofErr w:type="spellStart"/>
+      <w:r>
+        <w:rPr>
+          <w:rFonts w:ascii="Courier New" w:eastAsia="Courier New" w:hAnsi="Courier New"/>
+          <w:sz w:val="17"/>
+          <w:lang w:val="it-IT"/>
+        </w:rPr>
+        <w:t>id_costume</w:t>
+      </w:r>
+      <w:proofErr w:type="spellEnd"/>
+      <w:r>
+        <w:rPr>
+          <w:rFonts w:ascii="Courier New" w:eastAsia="Courier New" w:hAnsi="Courier New"/>
+          <w:sz w:val="17"/>
+          <w:lang w:val="it-IT"/>
+        </w:rPr>
+        <w:t xml:space="preserve"> FK -&gt; COSTUME, </w:t>
+      </w:r>
+      <w:proofErr w:type="spellStart"/>
+      <w:r>
+        <w:rPr>
+          <w:rFonts w:ascii="Courier New" w:eastAsia="Courier New" w:hAnsi="Courier New"/>
+          <w:sz w:val="17"/>
+          <w:lang w:val="it-IT"/>
+        </w:rPr>
+        <w:t>id_coreografia</w:t>
+      </w:r>
+      <w:proofErr w:type="spellEnd"/>
+      <w:r>
+        <w:rPr>
+          <w:rFonts w:ascii="Courier New" w:eastAsia="Courier New" w:hAnsi="Courier New"/>
+          <w:sz w:val="17"/>
+          <w:lang w:val="it-IT"/>
+        </w:rPr>
+        <w:t xml:space="preserve"> FK -&gt; COREOGRAFIA, pagato, consegnato)</w:t>
+      </w:r>
+    </w:p>
+    <w:p>
+      <w:pPr>
+        <w:rPr>
+          <w:lang w:val="it-IT"/>
+        </w:rPr>
+      </w:pPr>
+      <w:proofErr w:type="gramStart"/>
+      <w:r>
+        <w:rPr>
+          <w:rFonts w:ascii="Courier New" w:hAnsi="Courier New"/>
+          <w:sz w:val="17"/>
+          <w:lang w:val="it-IT"/>
+        </w:rPr>
+        <w:t>COMPETIZIONE(</w:t>
+      </w:r>
+      <w:proofErr w:type="spellStart"/>
+      <w:proofErr w:type="gramEnd"/>
+      <w:r>
+        <w:rPr>
+          <w:rFonts w:ascii="Courier New" w:hAnsi="Courier New"/>
+          <w:sz w:val="17"/>
+          <w:lang w:val="it-IT"/>
+        </w:rPr>
+        <w:t>id_concorso</w:t>
+      </w:r>
+      <w:proofErr w:type="spellEnd"/>
+      <w:r>
+        <w:rPr>
+          <w:rFonts w:ascii="Courier New" w:hAnsi="Courier New"/>
+          <w:sz w:val="17"/>
+          <w:lang w:val="it-IT"/>
+        </w:rPr>
+        <w:t xml:space="preserve"> PK, classifica, </w:t>
+      </w:r>
+      <w:proofErr w:type="spellStart"/>
+      <w:r>
+        <w:rPr>
+          <w:rFonts w:ascii="Courier New" w:hAnsi="Courier New"/>
+          <w:sz w:val="17"/>
+          <w:lang w:val="it-IT"/>
+        </w:rPr>
+        <w:t>numero_giudici</w:t>
+      </w:r>
+      <w:proofErr w:type="spellEnd"/>
+      <w:r>
+        <w:rPr>
+          <w:rFonts w:ascii="Courier New" w:hAnsi="Courier New"/>
+          <w:sz w:val="17"/>
+          <w:lang w:val="it-IT"/>
+        </w:rPr>
+        <w:t>)</w:t>
+      </w:r>
+    </w:p>
+    <w:p>
+      <w:pPr>
+        <w:rPr>
+          <w:lang w:val="it-IT"/>
+        </w:rPr>
+      </w:pPr>
+      <w:r>
+        <w:rPr>
+          <w:rFonts w:ascii="Courier New" w:hAnsi="Courier New"/>
+          <w:sz w:val="17"/>
+          <w:lang w:val="it-IT"/>
+        </w:rPr>
+        <w:t>ISCRIZIONE_</w:t>
+      </w:r>
+      <w:proofErr w:type="gramStart"/>
+      <w:r>
+        <w:rPr>
+          <w:rFonts w:ascii="Courier New" w:hAnsi="Courier New"/>
+          <w:sz w:val="17"/>
+          <w:lang w:val="it-IT"/>
+        </w:rPr>
+        <w:t>COMPETIZIONE(</w:t>
+      </w:r>
+      <w:proofErr w:type="spellStart"/>
+      <w:proofErr w:type="gramEnd"/>
+      <w:r>
+        <w:rPr>
+          <w:rFonts w:ascii="Courier New" w:hAnsi="Courier New"/>
+          <w:sz w:val="17"/>
+          <w:lang w:val="it-IT"/>
+        </w:rPr>
+        <w:t>id_iscrizione</w:t>
+      </w:r>
+      <w:proofErr w:type="spellEnd"/>
+      <w:r>
+        <w:rPr>
+          <w:rFonts w:ascii="Courier New" w:hAnsi="Courier New"/>
+          <w:sz w:val="17"/>
+          <w:lang w:val="it-IT"/>
+        </w:rPr>
+        <w:t xml:space="preserve"> PK, </w:t>
+      </w:r>
+      <w:proofErr w:type="spellStart"/>
+      <w:r>
+        <w:rPr>
+          <w:rFonts w:ascii="Courier New" w:hAnsi="Courier New"/>
+          <w:sz w:val="17"/>
+          <w:lang w:val="it-IT"/>
+        </w:rPr>
+        <w:t>id_allieva</w:t>
+      </w:r>
+      <w:proofErr w:type="spellEnd"/>
+      <w:r>
+        <w:rPr>
+          <w:rFonts w:ascii="Courier New" w:hAnsi="Courier New"/>
+          <w:sz w:val="17"/>
+          <w:lang w:val="it-IT"/>
+        </w:rPr>
+        <w:t xml:space="preserve"> FK -&gt; ALLIEVA, </w:t>
+      </w:r>
+      <w:proofErr w:type="spellStart"/>
+      <w:r>
+        <w:rPr>
+          <w:rFonts w:ascii="Courier New" w:hAnsi="Courier New"/>
+          <w:sz w:val="17"/>
+          <w:lang w:val="it-IT"/>
+        </w:rPr>
+        <w:t>id_concorso</w:t>
+      </w:r>
+      <w:proofErr w:type="spellEnd"/>
+      <w:r>
+        <w:rPr>
+          <w:rFonts w:ascii="Courier New" w:hAnsi="Courier New"/>
+          <w:sz w:val="17"/>
+          <w:lang w:val="it-IT"/>
+        </w:rPr>
+        <w:t xml:space="preserve"> FK -&gt; COMPETIZIONE)</w:t>
+      </w:r>
+    </w:p>
+    <w:p>
+      <w:pPr>
+        <w:pStyle w:val="Titolo1"/>
+        <w:rPr>
+          <w:sz w:val="26"/>
+          <w:szCs w:val="26"/>
+          <w:lang w:val="it-IT"/>
+        </w:rPr>
+      </w:pPr>
+      <w:r>
+        <w:rPr>
+          <w:sz w:val="26"/>
+          <w:szCs w:val="26"/>
+          <w:lang w:val="it-IT"/>
+        </w:rPr>
+        <w:t xml:space="preserve">9. </w:t>
+      </w:r>
+      <w:r>
+        <w:rPr>
+          <w:sz w:val="26"/>
+          <w:szCs w:val="26"/>
+          <w:lang w:val="it-IT"/>
+        </w:rPr>
+        <w:t>Normalizzazione dello schema</w:t>
+      </w:r>
+    </w:p>
+    <w:p>
+      <w:pPr>
+        <w:rPr>
+          <w:lang w:val="it-IT"/>
+        </w:rPr>
+      </w:pPr>
+      <w:r>
+        <w:rPr>
+          <w:lang w:val="it-IT"/>
+        </w:rPr>
+        <w:t>Lo schema progettato è stato definito seguendo i principi della normalizzazione al fine di ridurre la ridondanza dei dati e prevenire anomalie di aggiornamento.</w:t>
+      </w:r>
+    </w:p>
+    <w:p>
+      <w:pPr>
+        <w:rPr>
+          <w:lang w:val="it-IT"/>
+        </w:rPr>
+      </w:pPr>
+      <w:r>
+        <w:rPr>
+          <w:lang w:val="it-IT"/>
+        </w:rPr>
+        <w:t>• Prima Forma Normale (1NF): tutte le tabelle contengono attributi atomici e non sono presenti gruppi ripetuti.</w:t>
+      </w:r>
+    </w:p>
+    <w:p>
+      <w:pPr>
+        <w:rPr>
+          <w:lang w:val="it-IT"/>
+        </w:rPr>
+      </w:pPr>
+      <w:r>
+        <w:rPr>
+          <w:lang w:val="it-IT"/>
+        </w:rPr>
+        <w:t>• Seconda Forma Normale (2NF): tutti gli attributi non chiave dipendono interamente dalla chiave primaria della rispettiva tabella.</w:t>
+      </w:r>
+    </w:p>
+    <w:p>
+      <w:pPr>
+        <w:rPr>
+          <w:lang w:val="it-IT"/>
+        </w:rPr>
+      </w:pPr>
+      <w:r>
+        <w:rPr>
+          <w:lang w:val="it-IT"/>
+        </w:rPr>
+        <w:t>• Terza Forma Normale (3NF): non sono presenti dipendenze transitive tra attributi non chiave; ogni attributo dipende esclusivamente dalla chiave primaria.</w:t>
+      </w:r>
+    </w:p>
+    <w:p>
+      <w:pPr>
+        <w:rPr>
+          <w:lang w:val="it-IT"/>
+        </w:rPr>
+      </w:pPr>
+      <w:r>
+        <w:rPr>
+          <w:lang w:val="it-IT"/>
+        </w:rPr>
+        <w:lastRenderedPageBreak/>
+        <w:t>Di conseguenza, lo schema relazionale ottenuto può essere considerato conforme alla Terza Forma Normale (3NF), garantendo una buona organizzazione dei dati e una corretta gestione delle operazioni di inserimento, modifica e cancellazione.</w:t>
+      </w:r>
+    </w:p>
+    <w:p>
+      <w:pPr>
+        <w:pStyle w:val="Titolo1"/>
+        <w:rPr>
+          <w:lang w:val="it-IT"/>
+        </w:rPr>
+      </w:pPr>
+      <w:r>
+        <w:rPr>
+          <w:lang w:val="it-IT"/>
+        </w:rPr>
+        <w:t>10</w:t>
+      </w:r>
+      <w:r>
+        <w:rPr>
+          <w:lang w:val="it-IT"/>
+        </w:rPr>
+        <w:t>. Vincoli del sistema e trigger</w:t>
+      </w:r>
+    </w:p>
+    <w:p>
+      <w:pPr>
+        <w:jc w:val="both"/>
+        <w:rPr>
+          <w:lang w:val="it-IT"/>
+        </w:rPr>
+      </w:pPr>
+      <w:r>
+        <w:rPr>
+          <w:sz w:val="21"/>
+          <w:lang w:val="it-IT"/>
+        </w:rPr>
         <w:t>Il sistema prevede vincoli di integrità referenziale, vincoli di dominio e vincoli logici.</w:t>
       </w:r>
     </w:p>
@@ -6419,6 +6987,7 @@
       <w:pPr>
         <w:jc w:val="both"/>
         <w:rPr>
+          <w:sz w:val="21"/>
           <w:lang w:val="it-IT"/>
         </w:rPr>
       </w:pPr>
@@ -6428,295 +6997,6 @@
           <w:lang w:val="it-IT"/>
         </w:rPr>
         <w:t>Il vincolo sulla sovrapposizione delle lezioni non riguarda un singolo attributo, ma richiede il confronto tra il nuovo inserimento e i record già presenti nella tabella Lezioni. Per questo motivo è adatto a essere implementato tramite trigger.</w:t>
-      </w:r>
-    </w:p>
-    <w:p>
-      <w:pPr>
-        <w:rPr>
-          <w:lang w:val="it-IT"/>
-        </w:rPr>
-      </w:pPr>
-      <w:r>
-        <w:rPr>
-          <w:rFonts w:ascii="Courier New" w:eastAsia="Courier New" w:hAnsi="Courier New"/>
-          <w:sz w:val="17"/>
-          <w:lang w:val="it-IT"/>
-        </w:rPr>
-        <w:t xml:space="preserve">CREATE TRIGGER </w:t>
-      </w:r>
-      <w:proofErr w:type="spellStart"/>
-      <w:r>
-        <w:rPr>
-          <w:rFonts w:ascii="Courier New" w:eastAsia="Courier New" w:hAnsi="Courier New"/>
-          <w:sz w:val="17"/>
-          <w:lang w:val="it-IT"/>
-        </w:rPr>
-        <w:t>controllo_sovrapposizione_lezioni</w:t>
-      </w:r>
-      <w:proofErr w:type="spellEnd"/>
-      <w:r>
-        <w:rPr>
-          <w:rFonts w:ascii="Courier New" w:eastAsia="Courier New" w:hAnsi="Courier New"/>
-          <w:sz w:val="17"/>
-          <w:lang w:val="it-IT"/>
-        </w:rPr>
-        <w:br/>
-        <w:t>BEFORE INSERT ON Lezioni</w:t>
-      </w:r>
-      <w:r>
-        <w:rPr>
-          <w:rFonts w:ascii="Courier New" w:eastAsia="Courier New" w:hAnsi="Courier New"/>
-          <w:sz w:val="17"/>
-          <w:lang w:val="it-IT"/>
-        </w:rPr>
-        <w:br/>
-        <w:t>FOR EACH ROW</w:t>
-      </w:r>
-      <w:r>
-        <w:rPr>
-          <w:rFonts w:ascii="Courier New" w:eastAsia="Courier New" w:hAnsi="Courier New"/>
-          <w:sz w:val="17"/>
-          <w:lang w:val="it-IT"/>
-        </w:rPr>
-        <w:br/>
-        <w:t>BEGIN</w:t>
-      </w:r>
-      <w:r>
-        <w:rPr>
-          <w:rFonts w:ascii="Courier New" w:eastAsia="Courier New" w:hAnsi="Courier New"/>
-          <w:sz w:val="17"/>
-          <w:lang w:val="it-IT"/>
-        </w:rPr>
-        <w:br/>
-        <w:t xml:space="preserve">    SELECT</w:t>
-      </w:r>
-      <w:r>
-        <w:rPr>
-          <w:rFonts w:ascii="Courier New" w:eastAsia="Courier New" w:hAnsi="Courier New"/>
-          <w:sz w:val="17"/>
-          <w:lang w:val="it-IT"/>
-        </w:rPr>
-        <w:br/>
-        <w:t xml:space="preserve">        CASE</w:t>
-      </w:r>
-      <w:r>
-        <w:rPr>
-          <w:rFonts w:ascii="Courier New" w:eastAsia="Courier New" w:hAnsi="Courier New"/>
-          <w:sz w:val="17"/>
-          <w:lang w:val="it-IT"/>
-        </w:rPr>
-        <w:br/>
-        <w:t xml:space="preserve">            WHEN EXISTS (</w:t>
-      </w:r>
-      <w:r>
-        <w:rPr>
-          <w:rFonts w:ascii="Courier New" w:eastAsia="Courier New" w:hAnsi="Courier New"/>
-          <w:sz w:val="17"/>
-          <w:lang w:val="it-IT"/>
-        </w:rPr>
-        <w:br/>
-        <w:t xml:space="preserve">                SELECT 1</w:t>
-      </w:r>
-      <w:r>
-        <w:rPr>
-          <w:rFonts w:ascii="Courier New" w:eastAsia="Courier New" w:hAnsi="Courier New"/>
-          <w:sz w:val="17"/>
-          <w:lang w:val="it-IT"/>
-        </w:rPr>
-        <w:br/>
-        <w:t xml:space="preserve">                FROM Lezioni</w:t>
-      </w:r>
-      <w:r>
-        <w:rPr>
-          <w:rFonts w:ascii="Courier New" w:eastAsia="Courier New" w:hAnsi="Courier New"/>
-          <w:sz w:val="17"/>
-          <w:lang w:val="it-IT"/>
-        </w:rPr>
-        <w:br/>
-        <w:t xml:space="preserve">                WHERE </w:t>
-      </w:r>
-      <w:proofErr w:type="spellStart"/>
-      <w:r>
-        <w:rPr>
-          <w:rFonts w:ascii="Courier New" w:eastAsia="Courier New" w:hAnsi="Courier New"/>
-          <w:sz w:val="17"/>
-          <w:lang w:val="it-IT"/>
-        </w:rPr>
-        <w:t>id_maestra</w:t>
-      </w:r>
-      <w:proofErr w:type="spellEnd"/>
-      <w:r>
-        <w:rPr>
-          <w:rFonts w:ascii="Courier New" w:eastAsia="Courier New" w:hAnsi="Courier New"/>
-          <w:sz w:val="17"/>
-          <w:lang w:val="it-IT"/>
-        </w:rPr>
-        <w:t xml:space="preserve"> = </w:t>
-      </w:r>
-      <w:proofErr w:type="spellStart"/>
-      <w:r>
-        <w:rPr>
-          <w:rFonts w:ascii="Courier New" w:eastAsia="Courier New" w:hAnsi="Courier New"/>
-          <w:sz w:val="17"/>
-          <w:lang w:val="it-IT"/>
-        </w:rPr>
-        <w:t>NEW.id_maestra</w:t>
-      </w:r>
-      <w:proofErr w:type="spellEnd"/>
-      <w:r>
-        <w:rPr>
-          <w:rFonts w:ascii="Courier New" w:eastAsia="Courier New" w:hAnsi="Courier New"/>
-          <w:sz w:val="17"/>
-          <w:lang w:val="it-IT"/>
-        </w:rPr>
-        <w:br/>
-        <w:t xml:space="preserve">                  AND </w:t>
-      </w:r>
-      <w:proofErr w:type="spellStart"/>
-      <w:r>
-        <w:rPr>
-          <w:rFonts w:ascii="Courier New" w:eastAsia="Courier New" w:hAnsi="Courier New"/>
-          <w:sz w:val="17"/>
-          <w:lang w:val="it-IT"/>
-        </w:rPr>
-        <w:t>giorno_settimana</w:t>
-      </w:r>
-      <w:proofErr w:type="spellEnd"/>
-      <w:r>
-        <w:rPr>
-          <w:rFonts w:ascii="Courier New" w:eastAsia="Courier New" w:hAnsi="Courier New"/>
-          <w:sz w:val="17"/>
-          <w:lang w:val="it-IT"/>
-        </w:rPr>
-        <w:t xml:space="preserve"> = </w:t>
-      </w:r>
-      <w:proofErr w:type="spellStart"/>
-      <w:r>
-        <w:rPr>
-          <w:rFonts w:ascii="Courier New" w:eastAsia="Courier New" w:hAnsi="Courier New"/>
-          <w:sz w:val="17"/>
-          <w:lang w:val="it-IT"/>
-        </w:rPr>
-        <w:t>NEW.giorno_settimana</w:t>
-      </w:r>
-      <w:proofErr w:type="spellEnd"/>
-      <w:r>
-        <w:rPr>
-          <w:rFonts w:ascii="Courier New" w:eastAsia="Courier New" w:hAnsi="Courier New"/>
-          <w:sz w:val="17"/>
-          <w:lang w:val="it-IT"/>
-        </w:rPr>
-        <w:br/>
-        <w:t xml:space="preserve">                  AND </w:t>
-      </w:r>
-      <w:proofErr w:type="spellStart"/>
-      <w:r>
-        <w:rPr>
-          <w:rFonts w:ascii="Courier New" w:eastAsia="Courier New" w:hAnsi="Courier New"/>
-          <w:sz w:val="17"/>
-          <w:lang w:val="it-IT"/>
-        </w:rPr>
-        <w:t>ora_inizio</w:t>
-      </w:r>
-      <w:proofErr w:type="spellEnd"/>
-      <w:r>
-        <w:rPr>
-          <w:rFonts w:ascii="Courier New" w:eastAsia="Courier New" w:hAnsi="Courier New"/>
-          <w:sz w:val="17"/>
-          <w:lang w:val="it-IT"/>
-        </w:rPr>
-        <w:t xml:space="preserve"> = </w:t>
-      </w:r>
-      <w:proofErr w:type="spellStart"/>
-      <w:r>
-        <w:rPr>
-          <w:rFonts w:ascii="Courier New" w:eastAsia="Courier New" w:hAnsi="Courier New"/>
-          <w:sz w:val="17"/>
-          <w:lang w:val="it-IT"/>
-        </w:rPr>
-        <w:t>NEW.ora_inizio</w:t>
-      </w:r>
-      <w:proofErr w:type="spellEnd"/>
-      <w:r>
-        <w:rPr>
-          <w:rFonts w:ascii="Courier New" w:eastAsia="Courier New" w:hAnsi="Courier New"/>
-          <w:sz w:val="17"/>
-          <w:lang w:val="it-IT"/>
-        </w:rPr>
-        <w:br/>
-        <w:t xml:space="preserve">            )</w:t>
-      </w:r>
-      <w:r>
-        <w:rPr>
-          <w:rFonts w:ascii="Courier New" w:eastAsia="Courier New" w:hAnsi="Courier New"/>
-          <w:sz w:val="17"/>
-          <w:lang w:val="it-IT"/>
-        </w:rPr>
-        <w:br/>
-        <w:t xml:space="preserve">            THEN RAISE(</w:t>
-      </w:r>
-      <w:r>
-        <w:rPr>
-          <w:rFonts w:ascii="Courier New" w:eastAsia="Courier New" w:hAnsi="Courier New"/>
-          <w:sz w:val="17"/>
-          <w:lang w:val="it-IT"/>
-        </w:rPr>
-        <w:br/>
-        <w:t xml:space="preserve">                ABORT,</w:t>
-      </w:r>
-      <w:r>
-        <w:rPr>
-          <w:rFonts w:ascii="Courier New" w:eastAsia="Courier New" w:hAnsi="Courier New"/>
-          <w:sz w:val="17"/>
-          <w:lang w:val="it-IT"/>
-        </w:rPr>
-        <w:br/>
-        <w:t xml:space="preserve">                'Errore: la maestra ha </w:t>
-      </w:r>
-      <w:proofErr w:type="spellStart"/>
-      <w:r>
-        <w:rPr>
-          <w:rFonts w:ascii="Courier New" w:eastAsia="Courier New" w:hAnsi="Courier New"/>
-          <w:sz w:val="17"/>
-          <w:lang w:val="it-IT"/>
-        </w:rPr>
-        <w:t>gia</w:t>
-      </w:r>
-      <w:proofErr w:type="spellEnd"/>
-      <w:r>
-        <w:rPr>
-          <w:rFonts w:ascii="Courier New" w:eastAsia="Courier New" w:hAnsi="Courier New"/>
-          <w:sz w:val="17"/>
-          <w:lang w:val="it-IT"/>
-        </w:rPr>
-        <w:t xml:space="preserve"> una lezione in questo giorno e orario'</w:t>
-      </w:r>
-      <w:r>
-        <w:rPr>
-          <w:rFonts w:ascii="Courier New" w:eastAsia="Courier New" w:hAnsi="Courier New"/>
-          <w:sz w:val="17"/>
-          <w:lang w:val="it-IT"/>
-        </w:rPr>
-        <w:br/>
-        <w:t xml:space="preserve">            )</w:t>
-      </w:r>
-      <w:r>
-        <w:rPr>
-          <w:rFonts w:ascii="Courier New" w:eastAsia="Courier New" w:hAnsi="Courier New"/>
-          <w:sz w:val="17"/>
-          <w:lang w:val="it-IT"/>
-        </w:rPr>
-        <w:br/>
-        <w:t xml:space="preserve">        END;</w:t>
-      </w:r>
-      <w:r>
-        <w:rPr>
-          <w:rFonts w:ascii="Courier New" w:eastAsia="Courier New" w:hAnsi="Courier New"/>
-          <w:sz w:val="17"/>
-          <w:lang w:val="it-IT"/>
-        </w:rPr>
-        <w:br/>
-        <w:t>END;</w:t>
       </w:r>
     </w:p>
     <w:p>
@@ -6728,11 +7008,372 @@
       </w:pPr>
       <w:r>
         <w:rPr>
+          <w:lang w:val="it-IT"/>
+        </w:rPr>
+        <w:t>Il trigger per il controllo della sovrapposizione delle lezioni è stato progettato come vincolo aggiuntivo, ma non implementato fisicamente nel database finale. La scelta è stata quella di lasciare questo controllo come possibile estensione futura o come controllo gestibile a livello applicativo.</w:t>
+      </w:r>
+    </w:p>
+    <w:p>
+      <w:pPr>
+        <w:rPr>
+          <w:lang w:val="it-IT"/>
+        </w:rPr>
+      </w:pPr>
+      <w:r>
+        <w:rPr>
+          <w:rFonts w:ascii="Courier New" w:eastAsia="Courier New" w:hAnsi="Courier New"/>
+          <w:sz w:val="17"/>
+          <w:lang w:val="it-IT"/>
+        </w:rPr>
+        <w:t xml:space="preserve">CREATE TRIGGER </w:t>
+      </w:r>
+      <w:proofErr w:type="spellStart"/>
+      <w:r>
+        <w:rPr>
+          <w:rFonts w:ascii="Courier New" w:eastAsia="Courier New" w:hAnsi="Courier New"/>
+          <w:sz w:val="17"/>
+          <w:lang w:val="it-IT"/>
+        </w:rPr>
+        <w:t>controllo_sovrapposizione_lezioni</w:t>
+      </w:r>
+      <w:proofErr w:type="spellEnd"/>
+      <w:r>
+        <w:rPr>
+          <w:rFonts w:ascii="Courier New" w:eastAsia="Courier New" w:hAnsi="Courier New"/>
+          <w:sz w:val="17"/>
+          <w:lang w:val="it-IT"/>
+        </w:rPr>
+        <w:br/>
+        <w:t>BEFORE INSERT ON Lezioni</w:t>
+      </w:r>
+      <w:r>
+        <w:rPr>
+          <w:rFonts w:ascii="Courier New" w:eastAsia="Courier New" w:hAnsi="Courier New"/>
+          <w:sz w:val="17"/>
+          <w:lang w:val="it-IT"/>
+        </w:rPr>
+        <w:br/>
+        <w:t>FOR EACH ROW</w:t>
+      </w:r>
+      <w:r>
+        <w:rPr>
+          <w:rFonts w:ascii="Courier New" w:eastAsia="Courier New" w:hAnsi="Courier New"/>
+          <w:sz w:val="17"/>
+          <w:lang w:val="it-IT"/>
+        </w:rPr>
+        <w:br/>
+        <w:t>BEGIN</w:t>
+      </w:r>
+      <w:r>
+        <w:rPr>
+          <w:rFonts w:ascii="Courier New" w:eastAsia="Courier New" w:hAnsi="Courier New"/>
+          <w:sz w:val="17"/>
+          <w:lang w:val="it-IT"/>
+        </w:rPr>
+        <w:br/>
+        <w:t xml:space="preserve">    SELECT</w:t>
+      </w:r>
+      <w:r>
+        <w:rPr>
+          <w:rFonts w:ascii="Courier New" w:eastAsia="Courier New" w:hAnsi="Courier New"/>
+          <w:sz w:val="17"/>
+          <w:lang w:val="it-IT"/>
+        </w:rPr>
+        <w:br/>
+        <w:t xml:space="preserve">        CASE</w:t>
+      </w:r>
+      <w:r>
+        <w:rPr>
+          <w:rFonts w:ascii="Courier New" w:eastAsia="Courier New" w:hAnsi="Courier New"/>
+          <w:sz w:val="17"/>
+          <w:lang w:val="it-IT"/>
+        </w:rPr>
+        <w:br/>
+        <w:t xml:space="preserve">            WHEN EXISTS (</w:t>
+      </w:r>
+      <w:r>
+        <w:rPr>
+          <w:rFonts w:ascii="Courier New" w:eastAsia="Courier New" w:hAnsi="Courier New"/>
+          <w:sz w:val="17"/>
+          <w:lang w:val="it-IT"/>
+        </w:rPr>
+        <w:br/>
+        <w:t xml:space="preserve">                SELECT 1</w:t>
+      </w:r>
+      <w:r>
+        <w:rPr>
+          <w:rFonts w:ascii="Courier New" w:eastAsia="Courier New" w:hAnsi="Courier New"/>
+          <w:sz w:val="17"/>
+          <w:lang w:val="it-IT"/>
+        </w:rPr>
+        <w:br/>
+        <w:t xml:space="preserve">                FROM Lezioni</w:t>
+      </w:r>
+      <w:r>
+        <w:rPr>
+          <w:rFonts w:ascii="Courier New" w:eastAsia="Courier New" w:hAnsi="Courier New"/>
+          <w:sz w:val="17"/>
+          <w:lang w:val="it-IT"/>
+        </w:rPr>
+        <w:br/>
+        <w:t xml:space="preserve">                WHERE </w:t>
+      </w:r>
+      <w:proofErr w:type="spellStart"/>
+      <w:r>
+        <w:rPr>
+          <w:rFonts w:ascii="Courier New" w:eastAsia="Courier New" w:hAnsi="Courier New"/>
+          <w:sz w:val="17"/>
+          <w:lang w:val="it-IT"/>
+        </w:rPr>
+        <w:t>id_maestra</w:t>
+      </w:r>
+      <w:proofErr w:type="spellEnd"/>
+      <w:r>
+        <w:rPr>
+          <w:rFonts w:ascii="Courier New" w:eastAsia="Courier New" w:hAnsi="Courier New"/>
+          <w:sz w:val="17"/>
+          <w:lang w:val="it-IT"/>
+        </w:rPr>
+        <w:t xml:space="preserve"> = </w:t>
+      </w:r>
+      <w:proofErr w:type="spellStart"/>
+      <w:r>
+        <w:rPr>
+          <w:rFonts w:ascii="Courier New" w:eastAsia="Courier New" w:hAnsi="Courier New"/>
+          <w:sz w:val="17"/>
+          <w:lang w:val="it-IT"/>
+        </w:rPr>
+        <w:t>NEW.id_maestra</w:t>
+      </w:r>
+      <w:proofErr w:type="spellEnd"/>
+      <w:r>
+        <w:rPr>
+          <w:rFonts w:ascii="Courier New" w:eastAsia="Courier New" w:hAnsi="Courier New"/>
+          <w:sz w:val="17"/>
+          <w:lang w:val="it-IT"/>
+        </w:rPr>
+        <w:br/>
+        <w:t xml:space="preserve">                  AND </w:t>
+      </w:r>
+      <w:proofErr w:type="spellStart"/>
+      <w:r>
+        <w:rPr>
+          <w:rFonts w:ascii="Courier New" w:eastAsia="Courier New" w:hAnsi="Courier New"/>
+          <w:sz w:val="17"/>
+          <w:lang w:val="it-IT"/>
+        </w:rPr>
+        <w:t>giorno_settimana</w:t>
+      </w:r>
+      <w:proofErr w:type="spellEnd"/>
+      <w:r>
+        <w:rPr>
+          <w:rFonts w:ascii="Courier New" w:eastAsia="Courier New" w:hAnsi="Courier New"/>
+          <w:sz w:val="17"/>
+          <w:lang w:val="it-IT"/>
+        </w:rPr>
+        <w:t xml:space="preserve"> = </w:t>
+      </w:r>
+      <w:proofErr w:type="spellStart"/>
+      <w:r>
+        <w:rPr>
+          <w:rFonts w:ascii="Courier New" w:eastAsia="Courier New" w:hAnsi="Courier New"/>
+          <w:sz w:val="17"/>
+          <w:lang w:val="it-IT"/>
+        </w:rPr>
+        <w:t>NEW.giorno_settimana</w:t>
+      </w:r>
+      <w:proofErr w:type="spellEnd"/>
+      <w:r>
+        <w:rPr>
+          <w:rFonts w:ascii="Courier New" w:eastAsia="Courier New" w:hAnsi="Courier New"/>
+          <w:sz w:val="17"/>
+          <w:lang w:val="it-IT"/>
+        </w:rPr>
+        <w:br/>
+        <w:t xml:space="preserve">                  AND </w:t>
+      </w:r>
+      <w:proofErr w:type="spellStart"/>
+      <w:r>
+        <w:rPr>
+          <w:rFonts w:ascii="Courier New" w:eastAsia="Courier New" w:hAnsi="Courier New"/>
+          <w:sz w:val="17"/>
+          <w:lang w:val="it-IT"/>
+        </w:rPr>
+        <w:t>ora_inizio</w:t>
+      </w:r>
+      <w:proofErr w:type="spellEnd"/>
+      <w:r>
+        <w:rPr>
+          <w:rFonts w:ascii="Courier New" w:eastAsia="Courier New" w:hAnsi="Courier New"/>
+          <w:sz w:val="17"/>
+          <w:lang w:val="it-IT"/>
+        </w:rPr>
+        <w:t xml:space="preserve"> = </w:t>
+      </w:r>
+      <w:proofErr w:type="spellStart"/>
+      <w:r>
+        <w:rPr>
+          <w:rFonts w:ascii="Courier New" w:eastAsia="Courier New" w:hAnsi="Courier New"/>
+          <w:sz w:val="17"/>
+          <w:lang w:val="it-IT"/>
+        </w:rPr>
+        <w:t>NEW.ora_inizio</w:t>
+      </w:r>
+      <w:proofErr w:type="spellEnd"/>
+      <w:r>
+        <w:rPr>
+          <w:rFonts w:ascii="Courier New" w:eastAsia="Courier New" w:hAnsi="Courier New"/>
+          <w:sz w:val="17"/>
+          <w:lang w:val="it-IT"/>
+        </w:rPr>
+        <w:br/>
+        <w:t xml:space="preserve">            )</w:t>
+      </w:r>
+      <w:r>
+        <w:rPr>
+          <w:rFonts w:ascii="Courier New" w:eastAsia="Courier New" w:hAnsi="Courier New"/>
+          <w:sz w:val="17"/>
+          <w:lang w:val="it-IT"/>
+        </w:rPr>
+        <w:br/>
+        <w:t xml:space="preserve">            THEN RAISE(</w:t>
+      </w:r>
+      <w:r>
+        <w:rPr>
+          <w:rFonts w:ascii="Courier New" w:eastAsia="Courier New" w:hAnsi="Courier New"/>
+          <w:sz w:val="17"/>
+          <w:lang w:val="it-IT"/>
+        </w:rPr>
+        <w:br/>
+        <w:t xml:space="preserve">                ABORT,</w:t>
+      </w:r>
+      <w:r>
+        <w:rPr>
+          <w:rFonts w:ascii="Courier New" w:eastAsia="Courier New" w:hAnsi="Courier New"/>
+          <w:sz w:val="17"/>
+          <w:lang w:val="it-IT"/>
+        </w:rPr>
+        <w:br/>
+        <w:t xml:space="preserve">                'Errore: la maestra ha </w:t>
+      </w:r>
+      <w:proofErr w:type="spellStart"/>
+      <w:r>
+        <w:rPr>
+          <w:rFonts w:ascii="Courier New" w:eastAsia="Courier New" w:hAnsi="Courier New"/>
+          <w:sz w:val="17"/>
+          <w:lang w:val="it-IT"/>
+        </w:rPr>
+        <w:t>gia</w:t>
+      </w:r>
+      <w:proofErr w:type="spellEnd"/>
+      <w:r>
+        <w:rPr>
+          <w:rFonts w:ascii="Courier New" w:eastAsia="Courier New" w:hAnsi="Courier New"/>
+          <w:sz w:val="17"/>
+          <w:lang w:val="it-IT"/>
+        </w:rPr>
+        <w:t xml:space="preserve"> una lezione in questo giorno e orario'</w:t>
+      </w:r>
+      <w:r>
+        <w:rPr>
+          <w:rFonts w:ascii="Courier New" w:eastAsia="Courier New" w:hAnsi="Courier New"/>
+          <w:sz w:val="17"/>
+          <w:lang w:val="it-IT"/>
+        </w:rPr>
+        <w:br/>
+        <w:t xml:space="preserve">            )</w:t>
+      </w:r>
+      <w:r>
+        <w:rPr>
+          <w:rFonts w:ascii="Courier New" w:eastAsia="Courier New" w:hAnsi="Courier New"/>
+          <w:sz w:val="17"/>
+          <w:lang w:val="it-IT"/>
+        </w:rPr>
+        <w:br/>
+        <w:t xml:space="preserve">        END;</w:t>
+      </w:r>
+      <w:r>
+        <w:rPr>
+          <w:rFonts w:ascii="Courier New" w:eastAsia="Courier New" w:hAnsi="Courier New"/>
+          <w:sz w:val="17"/>
+          <w:lang w:val="it-IT"/>
+        </w:rPr>
+        <w:br/>
+        <w:t>END;</w:t>
+      </w:r>
+    </w:p>
+    <w:p>
+      <w:pPr>
+        <w:jc w:val="both"/>
+        <w:rPr>
           <w:sz w:val="21"/>
           <w:lang w:val="it-IT"/>
         </w:rPr>
-        <w:t>Il trigger viene eseguito prima dell’inserimento di una nuova lezione. Se esiste già una lezione con la stessa maestra, lo stesso giorno e la stessa ora di inizio, l’inserimento viene bloccato.</w:t>
-      </w:r>
+      </w:pPr>
+      <w:r>
+        <w:rPr>
+          <w:sz w:val="21"/>
+          <w:lang w:val="it-IT"/>
+        </w:rPr>
+        <w:t>Se, implementato, il</w:t>
+      </w:r>
+      <w:r>
+        <w:rPr>
+          <w:sz w:val="21"/>
+          <w:lang w:val="it-IT"/>
+        </w:rPr>
+        <w:t xml:space="preserve"> trigger v</w:t>
+      </w:r>
+      <w:r>
+        <w:rPr>
+          <w:sz w:val="21"/>
+          <w:lang w:val="it-IT"/>
+        </w:rPr>
+        <w:t>errebbe</w:t>
+      </w:r>
+      <w:r>
+        <w:rPr>
+          <w:sz w:val="21"/>
+          <w:lang w:val="it-IT"/>
+        </w:rPr>
+        <w:t xml:space="preserve"> eseguito prima dell’inserimento di una nuova lezione. Se es</w:t>
+      </w:r>
+      <w:r>
+        <w:rPr>
+          <w:sz w:val="21"/>
+          <w:lang w:val="it-IT"/>
+        </w:rPr>
+        <w:t>istesse</w:t>
+      </w:r>
+      <w:r>
+        <w:rPr>
+          <w:sz w:val="21"/>
+          <w:lang w:val="it-IT"/>
+        </w:rPr>
+        <w:t xml:space="preserve"> già una lezione con la stessa maestra, lo stesso giorno e la stessa ora di inizio, l’inserimento v</w:t>
+      </w:r>
+      <w:r>
+        <w:rPr>
+          <w:sz w:val="21"/>
+          <w:lang w:val="it-IT"/>
+        </w:rPr>
+        <w:t>errebbe</w:t>
+      </w:r>
+      <w:r>
+        <w:rPr>
+          <w:sz w:val="21"/>
+          <w:lang w:val="it-IT"/>
+        </w:rPr>
+        <w:t xml:space="preserve"> bloccato.</w:t>
+      </w:r>
+    </w:p>
+    <w:p>
+      <w:pPr>
+        <w:jc w:val="both"/>
+        <w:rPr>
+          <w:lang w:val="it-IT"/>
+        </w:rPr>
+      </w:pPr>
     </w:p>
     <w:p>
       <w:pPr>
@@ -6745,6 +7386,7 @@
         <w:rPr>
           <w:lang w:val="it-IT"/>
         </w:rPr>
+        <w:lastRenderedPageBreak/>
         <w:t>11</w:t>
       </w:r>
       <w:r>
@@ -6792,78 +7434,204 @@
       <w:pPr>
         <w:pStyle w:val="Puntoelenco"/>
       </w:pPr>
+      <w:proofErr w:type="spellStart"/>
       <w:r>
         <w:rPr>
           <w:sz w:val="21"/>
         </w:rPr>
-        <w:t>inserire e modificare allieve</w:t>
-      </w:r>
+        <w:t>inserire</w:t>
+      </w:r>
+      <w:proofErr w:type="spellEnd"/>
+      <w:r>
+        <w:rPr>
+          <w:sz w:val="21"/>
+        </w:rPr>
+        <w:t xml:space="preserve"> e </w:t>
+      </w:r>
+      <w:proofErr w:type="spellStart"/>
+      <w:r>
+        <w:rPr>
+          <w:sz w:val="21"/>
+        </w:rPr>
+        <w:t>modificare</w:t>
+      </w:r>
+      <w:proofErr w:type="spellEnd"/>
+      <w:r>
+        <w:rPr>
+          <w:sz w:val="21"/>
+        </w:rPr>
+        <w:t xml:space="preserve"> </w:t>
+      </w:r>
+      <w:proofErr w:type="spellStart"/>
+      <w:r>
+        <w:rPr>
+          <w:sz w:val="21"/>
+        </w:rPr>
+        <w:t>allieve</w:t>
+      </w:r>
+      <w:proofErr w:type="spellEnd"/>
     </w:p>
     <w:p>
       <w:pPr>
         <w:pStyle w:val="Puntoelenco"/>
       </w:pPr>
+      <w:proofErr w:type="spellStart"/>
       <w:r>
         <w:rPr>
           <w:sz w:val="21"/>
         </w:rPr>
-        <w:t>gestire maestre</w:t>
-      </w:r>
+        <w:t>gestire</w:t>
+      </w:r>
+      <w:proofErr w:type="spellEnd"/>
+      <w:r>
+        <w:rPr>
+          <w:sz w:val="21"/>
+        </w:rPr>
+        <w:t xml:space="preserve"> </w:t>
+      </w:r>
+      <w:proofErr w:type="spellStart"/>
+      <w:r>
+        <w:rPr>
+          <w:sz w:val="21"/>
+        </w:rPr>
+        <w:t>maestre</w:t>
+      </w:r>
+      <w:proofErr w:type="spellEnd"/>
     </w:p>
     <w:p>
       <w:pPr>
         <w:pStyle w:val="Puntoelenco"/>
       </w:pPr>
+      <w:proofErr w:type="spellStart"/>
       <w:r>
         <w:rPr>
           <w:sz w:val="21"/>
         </w:rPr>
-        <w:t>creare corsi</w:t>
-      </w:r>
+        <w:t>creare</w:t>
+      </w:r>
+      <w:proofErr w:type="spellEnd"/>
+      <w:r>
+        <w:rPr>
+          <w:sz w:val="21"/>
+        </w:rPr>
+        <w:t xml:space="preserve"> </w:t>
+      </w:r>
+      <w:proofErr w:type="spellStart"/>
+      <w:r>
+        <w:rPr>
+          <w:sz w:val="21"/>
+        </w:rPr>
+        <w:t>corsi</w:t>
+      </w:r>
+      <w:proofErr w:type="spellEnd"/>
     </w:p>
     <w:p>
       <w:pPr>
         <w:pStyle w:val="Puntoelenco"/>
       </w:pPr>
+      <w:proofErr w:type="spellStart"/>
       <w:r>
         <w:rPr>
           <w:sz w:val="21"/>
         </w:rPr>
-        <w:t>controllare pagamenti</w:t>
-      </w:r>
+        <w:t>controllare</w:t>
+      </w:r>
+      <w:proofErr w:type="spellEnd"/>
+      <w:r>
+        <w:rPr>
+          <w:sz w:val="21"/>
+        </w:rPr>
+        <w:t xml:space="preserve"> </w:t>
+      </w:r>
+      <w:proofErr w:type="spellStart"/>
+      <w:r>
+        <w:rPr>
+          <w:sz w:val="21"/>
+        </w:rPr>
+        <w:t>pagamenti</w:t>
+      </w:r>
+      <w:proofErr w:type="spellEnd"/>
     </w:p>
     <w:p>
       <w:pPr>
         <w:pStyle w:val="Puntoelenco"/>
       </w:pPr>
+      <w:proofErr w:type="spellStart"/>
       <w:r>
         <w:rPr>
           <w:sz w:val="21"/>
         </w:rPr>
-        <w:t>organizzare saggi</w:t>
-      </w:r>
+        <w:t>organizzare</w:t>
+      </w:r>
+      <w:proofErr w:type="spellEnd"/>
+      <w:r>
+        <w:rPr>
+          <w:sz w:val="21"/>
+        </w:rPr>
+        <w:t xml:space="preserve"> </w:t>
+      </w:r>
+      <w:proofErr w:type="spellStart"/>
+      <w:r>
+        <w:rPr>
+          <w:sz w:val="21"/>
+        </w:rPr>
+        <w:t>saggi</w:t>
+      </w:r>
+      <w:proofErr w:type="spellEnd"/>
     </w:p>
     <w:p>
       <w:pPr>
         <w:pStyle w:val="Puntoelenco"/>
       </w:pPr>
+      <w:proofErr w:type="spellStart"/>
       <w:r>
         <w:rPr>
           <w:sz w:val="21"/>
         </w:rPr>
-        <w:t>aggiungere coreografie</w:t>
-      </w:r>
+        <w:t>aggiungere</w:t>
+      </w:r>
+      <w:proofErr w:type="spellEnd"/>
+      <w:r>
+        <w:rPr>
+          <w:sz w:val="21"/>
+        </w:rPr>
+        <w:t xml:space="preserve"> </w:t>
+      </w:r>
+      <w:proofErr w:type="spellStart"/>
+      <w:r>
+        <w:rPr>
+          <w:sz w:val="21"/>
+        </w:rPr>
+        <w:t>coreografie</w:t>
+      </w:r>
+      <w:proofErr w:type="spellEnd"/>
     </w:p>
     <w:p>
       <w:pPr>
         <w:pStyle w:val="Puntoelenco"/>
       </w:pPr>
+      <w:proofErr w:type="spellStart"/>
       <w:r>
         <w:rPr>
           <w:sz w:val="21"/>
         </w:rPr>
-        <w:t>gestire costumi</w:t>
-      </w:r>
+        <w:t>gestire</w:t>
+      </w:r>
+      <w:proofErr w:type="spellEnd"/>
+      <w:r>
+        <w:rPr>
+          <w:sz w:val="21"/>
+        </w:rPr>
+        <w:t xml:space="preserve"> </w:t>
+      </w:r>
+      <w:proofErr w:type="spellStart"/>
+      <w:r>
+        <w:rPr>
+          <w:sz w:val="21"/>
+        </w:rPr>
+        <w:t>costumi</w:t>
+      </w:r>
+      <w:proofErr w:type="spellEnd"/>
     </w:p>
     <w:p>
       <w:pPr>
@@ -6877,7 +7645,6 @@
           <w:sz w:val="21"/>
           <w:lang w:val="it-IT"/>
         </w:rPr>
-        <w:lastRenderedPageBreak/>
         <w:t>gestire competizioni e iscrizioni alle competizioni</w:t>
       </w:r>
     </w:p>
@@ -7002,9 +7769,11 @@
             <w:vAlign w:val="center"/>
           </w:tcPr>
           <w:p>
+            <w:proofErr w:type="spellStart"/>
             <w:r>
               <w:t>Ruolo</w:t>
             </w:r>
+            <w:proofErr w:type="spellEnd"/>
           </w:p>
         </w:tc>
       </w:tr>
@@ -7107,8 +7876,29 @@
             <w:tcW w:w="5095" w:type="dxa"/>
           </w:tcPr>
           <w:p>
-            <w:r>
-              <w:t>Pagine dell’interfaccia utente.</w:t>
+            <w:proofErr w:type="spellStart"/>
+            <w:r>
+              <w:t>Pagine</w:t>
+            </w:r>
+            <w:proofErr w:type="spellEnd"/>
+            <w:r>
+              <w:t xml:space="preserve"> </w:t>
+            </w:r>
+            <w:proofErr w:type="spellStart"/>
+            <w:r>
+              <w:t>dell’interfaccia</w:t>
+            </w:r>
+            <w:proofErr w:type="spellEnd"/>
+            <w:r>
+              <w:t xml:space="preserve"> </w:t>
+            </w:r>
+            <w:proofErr w:type="spellStart"/>
+            <w:r>
+              <w:t>utente</w:t>
+            </w:r>
+            <w:proofErr w:type="spellEnd"/>
+            <w:r>
+              <w:t>.</w:t>
             </w:r>
           </w:p>
         </w:tc>
@@ -7132,8 +7922,29 @@
             <w:tcW w:w="5095" w:type="dxa"/>
           </w:tcPr>
           <w:p>
-            <w:r>
-              <w:t>Gestione dello stile grafico.</w:t>
+            <w:proofErr w:type="spellStart"/>
+            <w:r>
+              <w:t>Gestione</w:t>
+            </w:r>
+            <w:proofErr w:type="spellEnd"/>
+            <w:r>
+              <w:t xml:space="preserve"> </w:t>
+            </w:r>
+            <w:proofErr w:type="spellStart"/>
+            <w:r>
+              <w:t>dello</w:t>
+            </w:r>
+            <w:proofErr w:type="spellEnd"/>
+            <w:r>
+              <w:t xml:space="preserve"> stile </w:t>
+            </w:r>
+            <w:proofErr w:type="spellStart"/>
+            <w:r>
+              <w:t>grafico</w:t>
+            </w:r>
+            <w:proofErr w:type="spellEnd"/>
+            <w:r>
+              <w:t>.</w:t>
             </w:r>
           </w:p>
         </w:tc>
@@ -7198,6 +8009,7 @@
           <w:noProof/>
           <w:lang w:val="it-IT"/>
         </w:rPr>
+        <w:lastRenderedPageBreak/>
         <w:drawing>
           <wp:inline distT="0" distB="0" distL="0" distR="0" wp14:anchorId="2611F3C9" wp14:editId="30E61DB1">
             <wp:extent cx="6477000" cy="2961005"/>
@@ -8136,7 +8948,6 @@
   <w:style w:type="character" w:default="1" w:styleId="Carpredefinitoparagrafo">
     <w:name w:val="Default Paragraph Font"/>
     <w:uiPriority w:val="1"/>
-    <w:semiHidden/>
     <w:unhideWhenUsed/>
   </w:style>
   <w:style w:type="table" w:default="1" w:styleId="Tabellanormale">

</xml_diff>